<commit_message>
Combine all real sources for us_hvac_10_99 into one report
Extended the M1 report with a real "Part B": BLS employment trend, SEC
EDGAR filings (Comfort Systems USA), SAM.gov opportunities, USAspending
awards ($642.7M combined, real top-5 listed), and a YouTube competitor-
discovery search -- all re-retrieved fresh via ingest_us_hvac_10_99.py.
Part A (the M1 score itself) is explicitly unchanged and stays
Census-only per the approved v1 formula; Part B is labeled as real
supporting context, not a silent change to the methodology.

Co-Authored-By: Claude Sonnet 5 <noreply@anthropic.com>
</commit_message>
<xml_diff>
--- a/outputs/reports/M1_Source_and_Methodology_us_hvac_10_99.docx
+++ b/outputs/reports/M1_Source_and_Methodology_us_hvac_10_99.docx
@@ -29,7 +29,7 @@
           <w:sz w:val="40"/>
           <w:szCs w:val="40"/>
         </w:rPr>
-        <w:t xml:space="preserve">M1 — Source &amp; Methodology Report</w:t>
+        <w:t xml:space="preserve">Combined Real Source Report</w:t>
       </w:r>
     </w:p>
     <w:p>
@@ -56,7 +56,7 @@
           <w:sz w:val="18"/>
           <w:szCs w:val="18"/>
         </w:rPr>
-        <w:t xml:space="preserve">Generated 2026-09-14 · Reproducible via scripts/run_census_m1.py</w:t>
+        <w:t xml:space="preserve">Generated 2026-09-14/15 · Part A: the real M1 score (Census-only, unchanged). Part B: every other real source retrieved for this market, combined in one place, with what fed a score vs. what is supporting context clearly separated.</w:t>
       </w:r>
     </w:p>
     <w:p>
@@ -68,6 +68,33 @@
       </w:pPr>
       <w:r>
         <w:t xml:space="preserve"/>
+      </w:r>
+    </w:p>
+    <w:p>
+      <w:pPr>
+        <w:spacing w:after="240" w:before="100"/>
+      </w:pPr>
+      <w:r>
+        <w:rPr>
+          <w:b/>
+          <w:bCs/>
+          <w:color w:val="1F3B57"/>
+          <w:sz w:val="24"/>
+          <w:szCs w:val="24"/>
+        </w:rPr>
+        <w:t xml:space="preserve">PART A — THE M1 SCORE (CENSUS CBP ONLY)</w:t>
+      </w:r>
+    </w:p>
+    <w:p>
+      <w:pPr>
+        <w:spacing w:after="140"/>
+      </w:pPr>
+      <w:r>
+        <w:rPr>
+          <w:i/>
+          <w:iCs/>
+        </w:rPr>
+        <w:t xml:space="preserve">M1's approved v1 formula (configs/formulas/v1.yaml) is deliberately built from one single source, Census CBP, so all five components share the exact same real geography/population and are mathematically comparable without approximation. Mixing in BLS, SEC, SAM.gov, or USAspending data here would silently change the approved M1 methodology — not something this report does. Those other real sources are combined separately in Part B as supporting market context, not as inputs to the 6.34 score.</w:t>
       </w:r>
     </w:p>
     <w:p>
@@ -3812,11 +3839,803 @@
     </w:p>
     <w:p>
       <w:pPr>
+        <w:spacing w:after="240" w:before="400"/>
+      </w:pPr>
+      <w:r>
+        <w:rPr>
+          <w:b/>
+          <w:bCs/>
+          <w:color w:val="1F3B57"/>
+          <w:sz w:val="24"/>
+          <w:szCs w:val="24"/>
+        </w:rPr>
+        <w:t xml:space="preserve">PART B — EVERY OTHER REAL SOURCE RETRIEVED FOR THIS MARKET</w:t>
+      </w:r>
+    </w:p>
+    <w:p>
+      <w:pPr>
+        <w:spacing w:after="140"/>
+      </w:pPr>
+      <w:r>
+        <w:t xml:space="preserve">Retrieved live on 2026-09-14/15 via scripts/ingest_us_hvac_10_99.py, which reuses the same tested official_data/youtube_data adapters M1 and M2 use — nothing here was scraped, typed by hand, or produced by a model. None of it changes the M1 score above; it is combined here as real, additional, independently-verifiable market evidence about the same market.</w:t>
+      </w:r>
+    </w:p>
+    <w:p>
+      <w:pPr>
         <w:pStyle w:val="Heading1"/>
         <w:spacing w:after="160" w:before="360"/>
       </w:pPr>
       <w:r>
-        <w:t xml:space="preserve">9. Reproducibility</w:t>
+        <w:t xml:space="preserve">9. Combined Source Register</w:t>
+      </w:r>
+    </w:p>
+    <w:tbl>
+      <w:tblPr>
+        <w:tblW w:type="dxa" w:w="9360"/>
+        <w:tblBorders>
+          <w:top w:val="single" w:color="auto" w:sz="4"/>
+          <w:left w:val="single" w:color="auto" w:sz="4"/>
+          <w:bottom w:val="single" w:color="auto" w:sz="4"/>
+          <w:right w:val="single" w:color="auto" w:sz="4"/>
+          <w:insideH w:val="single" w:color="auto" w:sz="4"/>
+          <w:insideV w:val="single" w:color="auto" w:sz="4"/>
+        </w:tblBorders>
+      </w:tblPr>
+      <w:tblGrid>
+        <w:gridCol w:w="2400"/>
+        <w:gridCol w:w="1600"/>
+        <w:gridCol w:w="5360"/>
+      </w:tblGrid>
+      <w:tr>
+        <w:trPr>
+          <w:tblHeader/>
+        </w:trPr>
+        <w:tc>
+          <w:tcPr>
+            <w:tcW w:type="dxa" w:w="2400"/>
+            <w:shd w:fill="1F3B57" w:val="clear"/>
+            <w:tcMar>
+              <w:top w:type="dxa" w:w="60"/>
+              <w:left w:type="dxa" w:w="100"/>
+              <w:bottom w:type="dxa" w:w="60"/>
+              <w:right w:type="dxa" w:w="100"/>
+            </w:tcMar>
+          </w:tcPr>
+          <w:p>
+            <w:pPr>
+              <w:jc w:val="left"/>
+            </w:pPr>
+            <w:r>
+              <w:rPr>
+                <w:b/>
+                <w:bCs/>
+                <w:color w:val="FFFFFF"/>
+                <w:sz w:val="20"/>
+                <w:szCs w:val="20"/>
+              </w:rPr>
+              <w:t xml:space="preserve">Source</w:t>
+            </w:r>
+          </w:p>
+        </w:tc>
+        <w:tc>
+          <w:tcPr>
+            <w:tcW w:type="dxa" w:w="1600"/>
+            <w:shd w:fill="1F3B57" w:val="clear"/>
+            <w:tcMar>
+              <w:top w:type="dxa" w:w="60"/>
+              <w:left w:type="dxa" w:w="100"/>
+              <w:bottom w:type="dxa" w:w="60"/>
+              <w:right w:type="dxa" w:w="100"/>
+            </w:tcMar>
+          </w:tcPr>
+          <w:p>
+            <w:pPr>
+              <w:jc w:val="left"/>
+            </w:pPr>
+            <w:r>
+              <w:rPr>
+                <w:b/>
+                <w:bCs/>
+                <w:color w:val="FFFFFF"/>
+                <w:sz w:val="20"/>
+                <w:szCs w:val="20"/>
+              </w:rPr>
+              <w:t xml:space="preserve">Status</w:t>
+            </w:r>
+          </w:p>
+        </w:tc>
+        <w:tc>
+          <w:tcPr>
+            <w:tcW w:type="dxa" w:w="5360"/>
+            <w:shd w:fill="1F3B57" w:val="clear"/>
+            <w:tcMar>
+              <w:top w:type="dxa" w:w="60"/>
+              <w:left w:type="dxa" w:w="100"/>
+              <w:bottom w:type="dxa" w:w="60"/>
+              <w:right w:type="dxa" w:w="100"/>
+            </w:tcMar>
+          </w:tcPr>
+          <w:p>
+            <w:pPr>
+              <w:jc w:val="left"/>
+            </w:pPr>
+            <w:r>
+              <w:rPr>
+                <w:b/>
+                <w:bCs/>
+                <w:color w:val="FFFFFF"/>
+                <w:sz w:val="20"/>
+                <w:szCs w:val="20"/>
+              </w:rPr>
+              <w:t xml:space="preserve">What was retrieved</w:t>
+            </w:r>
+          </w:p>
+        </w:tc>
+      </w:tr>
+      <w:tr>
+        <w:tc>
+          <w:tcPr>
+            <w:tcW w:type="dxa" w:w="2400"/>
+            <w:tcMar>
+              <w:top w:type="dxa" w:w="60"/>
+              <w:left w:type="dxa" w:w="100"/>
+              <w:bottom w:type="dxa" w:w="60"/>
+              <w:right w:type="dxa" w:w="100"/>
+            </w:tcMar>
+          </w:tcPr>
+          <w:p>
+            <w:pPr>
+              <w:jc w:val="left"/>
+            </w:pPr>
+            <w:r>
+              <w:rPr>
+                <w:b w:val="false"/>
+                <w:bCs w:val="false"/>
+                <w:color w:val="1A1A1A"/>
+                <w:sz w:val="20"/>
+                <w:szCs w:val="20"/>
+              </w:rPr>
+              <w:t xml:space="preserve">Census CBP</w:t>
+            </w:r>
+          </w:p>
+        </w:tc>
+        <w:tc>
+          <w:tcPr>
+            <w:tcW w:type="dxa" w:w="1600"/>
+            <w:tcMar>
+              <w:top w:type="dxa" w:w="60"/>
+              <w:left w:type="dxa" w:w="100"/>
+              <w:bottom w:type="dxa" w:w="60"/>
+              <w:right w:type="dxa" w:w="100"/>
+            </w:tcMar>
+          </w:tcPr>
+          <w:p>
+            <w:pPr>
+              <w:jc w:val="left"/>
+            </w:pPr>
+            <w:r>
+              <w:rPr>
+                <w:rFonts w:ascii="Consolas" w:cs="Consolas" w:eastAsia="Consolas" w:hAnsi="Consolas"/>
+                <w:b w:val="false"/>
+                <w:bCs w:val="false"/>
+                <w:color w:val="1A1A1A"/>
+                <w:sz w:val="18"/>
+                <w:szCs w:val="18"/>
+              </w:rPr>
+              <w:t xml:space="preserve">USED (Part A)</w:t>
+            </w:r>
+          </w:p>
+        </w:tc>
+        <w:tc>
+          <w:tcPr>
+            <w:tcW w:type="dxa" w:w="5360"/>
+            <w:tcMar>
+              <w:top w:type="dxa" w:w="60"/>
+              <w:left w:type="dxa" w:w="100"/>
+              <w:bottom w:type="dxa" w:w="60"/>
+              <w:right w:type="dxa" w:w="100"/>
+            </w:tcMar>
+          </w:tcPr>
+          <w:p>
+            <w:pPr>
+              <w:jc w:val="left"/>
+            </w:pPr>
+            <w:r>
+              <w:rPr>
+                <w:rFonts w:ascii="Consolas" w:cs="Consolas" w:eastAsia="Consolas" w:hAnsi="Consolas"/>
+                <w:b w:val="false"/>
+                <w:bCs w:val="false"/>
+                <w:color w:val="1A1A1A"/>
+                <w:sz w:val="18"/>
+                <w:szCs w:val="18"/>
+              </w:rPr>
+              <w:t xml:space="preserve">23,617 real establishments, 10–99 employees, NAICS 238220 (see Part A)</w:t>
+            </w:r>
+          </w:p>
+        </w:tc>
+      </w:tr>
+      <w:tr>
+        <w:tc>
+          <w:tcPr>
+            <w:tcW w:type="dxa" w:w="2400"/>
+            <w:tcMar>
+              <w:top w:type="dxa" w:w="60"/>
+              <w:left w:type="dxa" w:w="100"/>
+              <w:bottom w:type="dxa" w:w="60"/>
+              <w:right w:type="dxa" w:w="100"/>
+            </w:tcMar>
+          </w:tcPr>
+          <w:p>
+            <w:pPr>
+              <w:jc w:val="left"/>
+            </w:pPr>
+            <w:r>
+              <w:rPr>
+                <w:b w:val="false"/>
+                <w:bCs w:val="false"/>
+                <w:color w:val="1A1A1A"/>
+                <w:sz w:val="20"/>
+                <w:szCs w:val="20"/>
+              </w:rPr>
+              <w:t xml:space="preserve">BLS</w:t>
+            </w:r>
+          </w:p>
+        </w:tc>
+        <w:tc>
+          <w:tcPr>
+            <w:tcW w:type="dxa" w:w="1600"/>
+            <w:tcMar>
+              <w:top w:type="dxa" w:w="60"/>
+              <w:left w:type="dxa" w:w="100"/>
+              <w:bottom w:type="dxa" w:w="60"/>
+              <w:right w:type="dxa" w:w="100"/>
+            </w:tcMar>
+          </w:tcPr>
+          <w:p>
+            <w:pPr>
+              <w:jc w:val="left"/>
+            </w:pPr>
+            <w:r>
+              <w:rPr>
+                <w:rFonts w:ascii="Consolas" w:cs="Consolas" w:eastAsia="Consolas" w:hAnsi="Consolas"/>
+                <w:b w:val="false"/>
+                <w:bCs w:val="false"/>
+                <w:color w:val="1A1A1A"/>
+                <w:sz w:val="18"/>
+                <w:szCs w:val="18"/>
+              </w:rPr>
+              <w:t xml:space="preserve">USED</w:t>
+            </w:r>
+          </w:p>
+        </w:tc>
+        <w:tc>
+          <w:tcPr>
+            <w:tcW w:type="dxa" w:w="5360"/>
+            <w:tcMar>
+              <w:top w:type="dxa" w:w="60"/>
+              <w:left w:type="dxa" w:w="100"/>
+              <w:bottom w:type="dxa" w:w="60"/>
+              <w:right w:type="dxa" w:w="100"/>
+            </w:tcMar>
+          </w:tcPr>
+          <w:p>
+            <w:pPr>
+              <w:jc w:val="left"/>
+            </w:pPr>
+            <w:r>
+              <w:rPr>
+                <w:rFonts w:ascii="Consolas" w:cs="Consolas" w:eastAsia="Consolas" w:hAnsi="Consolas"/>
+                <w:b w:val="false"/>
+                <w:bCs w:val="false"/>
+                <w:color w:val="1A1A1A"/>
+                <w:sz w:val="18"/>
+                <w:szCs w:val="18"/>
+              </w:rPr>
+              <w:t xml:space="preserve">36 real monthly observations, Specialty Trade Contractors employment</w:t>
+            </w:r>
+          </w:p>
+        </w:tc>
+      </w:tr>
+      <w:tr>
+        <w:tc>
+          <w:tcPr>
+            <w:tcW w:type="dxa" w:w="2400"/>
+            <w:tcMar>
+              <w:top w:type="dxa" w:w="60"/>
+              <w:left w:type="dxa" w:w="100"/>
+              <w:bottom w:type="dxa" w:w="60"/>
+              <w:right w:type="dxa" w:w="100"/>
+            </w:tcMar>
+          </w:tcPr>
+          <w:p>
+            <w:pPr>
+              <w:jc w:val="left"/>
+            </w:pPr>
+            <w:r>
+              <w:rPr>
+                <w:b w:val="false"/>
+                <w:bCs w:val="false"/>
+                <w:color w:val="1A1A1A"/>
+                <w:sz w:val="20"/>
+                <w:szCs w:val="20"/>
+              </w:rPr>
+              <w:t xml:space="preserve">SEC EDGAR</w:t>
+            </w:r>
+          </w:p>
+        </w:tc>
+        <w:tc>
+          <w:tcPr>
+            <w:tcW w:type="dxa" w:w="1600"/>
+            <w:tcMar>
+              <w:top w:type="dxa" w:w="60"/>
+              <w:left w:type="dxa" w:w="100"/>
+              <w:bottom w:type="dxa" w:w="60"/>
+              <w:right w:type="dxa" w:w="100"/>
+            </w:tcMar>
+          </w:tcPr>
+          <w:p>
+            <w:pPr>
+              <w:jc w:val="left"/>
+            </w:pPr>
+            <w:r>
+              <w:rPr>
+                <w:rFonts w:ascii="Consolas" w:cs="Consolas" w:eastAsia="Consolas" w:hAnsi="Consolas"/>
+                <w:b w:val="false"/>
+                <w:bCs w:val="false"/>
+                <w:color w:val="1A1A1A"/>
+                <w:sz w:val="18"/>
+                <w:szCs w:val="18"/>
+              </w:rPr>
+              <w:t xml:space="preserve">USED</w:t>
+            </w:r>
+          </w:p>
+        </w:tc>
+        <w:tc>
+          <w:tcPr>
+            <w:tcW w:type="dxa" w:w="5360"/>
+            <w:tcMar>
+              <w:top w:type="dxa" w:w="60"/>
+              <w:left w:type="dxa" w:w="100"/>
+              <w:bottom w:type="dxa" w:w="60"/>
+              <w:right w:type="dxa" w:w="100"/>
+            </w:tcMar>
+          </w:tcPr>
+          <w:p>
+            <w:pPr>
+              <w:jc w:val="left"/>
+            </w:pPr>
+            <w:r>
+              <w:rPr>
+                <w:rFonts w:ascii="Consolas" w:cs="Consolas" w:eastAsia="Consolas" w:hAnsi="Consolas"/>
+                <w:b w:val="false"/>
+                <w:bCs w:val="false"/>
+                <w:color w:val="1A1A1A"/>
+                <w:sz w:val="18"/>
+                <w:szCs w:val="18"/>
+              </w:rPr>
+              <w:t xml:space="preserve">1,000 real filings, Comfort Systems USA Inc (NYSE: FIX)</w:t>
+            </w:r>
+          </w:p>
+        </w:tc>
+      </w:tr>
+      <w:tr>
+        <w:tc>
+          <w:tcPr>
+            <w:tcW w:type="dxa" w:w="2400"/>
+            <w:tcMar>
+              <w:top w:type="dxa" w:w="60"/>
+              <w:left w:type="dxa" w:w="100"/>
+              <w:bottom w:type="dxa" w:w="60"/>
+              <w:right w:type="dxa" w:w="100"/>
+            </w:tcMar>
+          </w:tcPr>
+          <w:p>
+            <w:pPr>
+              <w:jc w:val="left"/>
+            </w:pPr>
+            <w:r>
+              <w:rPr>
+                <w:b w:val="false"/>
+                <w:bCs w:val="false"/>
+                <w:color w:val="1A1A1A"/>
+                <w:sz w:val="20"/>
+                <w:szCs w:val="20"/>
+              </w:rPr>
+              <w:t xml:space="preserve">SAM.gov</w:t>
+            </w:r>
+          </w:p>
+        </w:tc>
+        <w:tc>
+          <w:tcPr>
+            <w:tcW w:type="dxa" w:w="1600"/>
+            <w:tcMar>
+              <w:top w:type="dxa" w:w="60"/>
+              <w:left w:type="dxa" w:w="100"/>
+              <w:bottom w:type="dxa" w:w="60"/>
+              <w:right w:type="dxa" w:w="100"/>
+            </w:tcMar>
+          </w:tcPr>
+          <w:p>
+            <w:pPr>
+              <w:jc w:val="left"/>
+            </w:pPr>
+            <w:r>
+              <w:rPr>
+                <w:rFonts w:ascii="Consolas" w:cs="Consolas" w:eastAsia="Consolas" w:hAnsi="Consolas"/>
+                <w:b w:val="false"/>
+                <w:bCs w:val="false"/>
+                <w:color w:val="1A1A1A"/>
+                <w:sz w:val="18"/>
+                <w:szCs w:val="18"/>
+              </w:rPr>
+              <w:t xml:space="preserve">USED</w:t>
+            </w:r>
+          </w:p>
+        </w:tc>
+        <w:tc>
+          <w:tcPr>
+            <w:tcW w:type="dxa" w:w="5360"/>
+            <w:tcMar>
+              <w:top w:type="dxa" w:w="60"/>
+              <w:left w:type="dxa" w:w="100"/>
+              <w:bottom w:type="dxa" w:w="60"/>
+              <w:right w:type="dxa" w:w="100"/>
+            </w:tcMar>
+          </w:tcPr>
+          <w:p>
+            <w:pPr>
+              <w:jc w:val="left"/>
+            </w:pPr>
+            <w:r>
+              <w:rPr>
+                <w:rFonts w:ascii="Consolas" w:cs="Consolas" w:eastAsia="Consolas" w:hAnsi="Consolas"/>
+                <w:b w:val="false"/>
+                <w:bCs w:val="false"/>
+                <w:color w:val="1A1A1A"/>
+                <w:sz w:val="18"/>
+                <w:szCs w:val="18"/>
+              </w:rPr>
+              <w:t xml:space="preserve">25 real federal procurement opportunities, NAICS 238220</w:t>
+            </w:r>
+          </w:p>
+        </w:tc>
+      </w:tr>
+      <w:tr>
+        <w:tc>
+          <w:tcPr>
+            <w:tcW w:type="dxa" w:w="2400"/>
+            <w:tcMar>
+              <w:top w:type="dxa" w:w="60"/>
+              <w:left w:type="dxa" w:w="100"/>
+              <w:bottom w:type="dxa" w:w="60"/>
+              <w:right w:type="dxa" w:w="100"/>
+            </w:tcMar>
+          </w:tcPr>
+          <w:p>
+            <w:pPr>
+              <w:jc w:val="left"/>
+            </w:pPr>
+            <w:r>
+              <w:rPr>
+                <w:b w:val="false"/>
+                <w:bCs w:val="false"/>
+                <w:color w:val="1A1A1A"/>
+                <w:sz w:val="20"/>
+                <w:szCs w:val="20"/>
+              </w:rPr>
+              <w:t xml:space="preserve">USAspending</w:t>
+            </w:r>
+          </w:p>
+        </w:tc>
+        <w:tc>
+          <w:tcPr>
+            <w:tcW w:type="dxa" w:w="1600"/>
+            <w:tcMar>
+              <w:top w:type="dxa" w:w="60"/>
+              <w:left w:type="dxa" w:w="100"/>
+              <w:bottom w:type="dxa" w:w="60"/>
+              <w:right w:type="dxa" w:w="100"/>
+            </w:tcMar>
+          </w:tcPr>
+          <w:p>
+            <w:pPr>
+              <w:jc w:val="left"/>
+            </w:pPr>
+            <w:r>
+              <w:rPr>
+                <w:rFonts w:ascii="Consolas" w:cs="Consolas" w:eastAsia="Consolas" w:hAnsi="Consolas"/>
+                <w:b w:val="false"/>
+                <w:bCs w:val="false"/>
+                <w:color w:val="1A1A1A"/>
+                <w:sz w:val="18"/>
+                <w:szCs w:val="18"/>
+              </w:rPr>
+              <w:t xml:space="preserve">USED</w:t>
+            </w:r>
+          </w:p>
+        </w:tc>
+        <w:tc>
+          <w:tcPr>
+            <w:tcW w:type="dxa" w:w="5360"/>
+            <w:tcMar>
+              <w:top w:type="dxa" w:w="60"/>
+              <w:left w:type="dxa" w:w="100"/>
+              <w:bottom w:type="dxa" w:w="60"/>
+              <w:right w:type="dxa" w:w="100"/>
+            </w:tcMar>
+          </w:tcPr>
+          <w:p>
+            <w:pPr>
+              <w:jc w:val="left"/>
+            </w:pPr>
+            <w:r>
+              <w:rPr>
+                <w:rFonts w:ascii="Consolas" w:cs="Consolas" w:eastAsia="Consolas" w:hAnsi="Consolas"/>
+                <w:b w:val="false"/>
+                <w:bCs w:val="false"/>
+                <w:color w:val="1A1A1A"/>
+                <w:sz w:val="18"/>
+                <w:szCs w:val="18"/>
+              </w:rPr>
+              <w:t xml:space="preserve">25 real federal contract awards, NAICS 238220, $642.7M combined</w:t>
+            </w:r>
+          </w:p>
+        </w:tc>
+      </w:tr>
+      <w:tr>
+        <w:tc>
+          <w:tcPr>
+            <w:tcW w:type="dxa" w:w="2400"/>
+            <w:tcMar>
+              <w:top w:type="dxa" w:w="60"/>
+              <w:left w:type="dxa" w:w="100"/>
+              <w:bottom w:type="dxa" w:w="60"/>
+              <w:right w:type="dxa" w:w="100"/>
+            </w:tcMar>
+          </w:tcPr>
+          <w:p>
+            <w:pPr>
+              <w:jc w:val="left"/>
+            </w:pPr>
+            <w:r>
+              <w:rPr>
+                <w:b w:val="false"/>
+                <w:bCs w:val="false"/>
+                <w:color w:val="1A1A1A"/>
+                <w:sz w:val="20"/>
+                <w:szCs w:val="20"/>
+              </w:rPr>
+              <w:t xml:space="preserve">YouTube Search</w:t>
+            </w:r>
+          </w:p>
+        </w:tc>
+        <w:tc>
+          <w:tcPr>
+            <w:tcW w:type="dxa" w:w="1600"/>
+            <w:tcMar>
+              <w:top w:type="dxa" w:w="60"/>
+              <w:left w:type="dxa" w:w="100"/>
+              <w:bottom w:type="dxa" w:w="60"/>
+              <w:right w:type="dxa" w:w="100"/>
+            </w:tcMar>
+          </w:tcPr>
+          <w:p>
+            <w:pPr>
+              <w:jc w:val="left"/>
+            </w:pPr>
+            <w:r>
+              <w:rPr>
+                <w:rFonts w:ascii="Consolas" w:cs="Consolas" w:eastAsia="Consolas" w:hAnsi="Consolas"/>
+                <w:b w:val="false"/>
+                <w:bCs w:val="false"/>
+                <w:color w:val="1A1A1A"/>
+                <w:sz w:val="18"/>
+                <w:szCs w:val="18"/>
+              </w:rPr>
+              <w:t xml:space="preserve">USED</w:t>
+            </w:r>
+          </w:p>
+        </w:tc>
+        <w:tc>
+          <w:tcPr>
+            <w:tcW w:type="dxa" w:w="5360"/>
+            <w:tcMar>
+              <w:top w:type="dxa" w:w="60"/>
+              <w:left w:type="dxa" w:w="100"/>
+              <w:bottom w:type="dxa" w:w="60"/>
+              <w:right w:type="dxa" w:w="100"/>
+            </w:tcMar>
+          </w:tcPr>
+          <w:p>
+            <w:pPr>
+              <w:jc w:val="left"/>
+            </w:pPr>
+            <w:r>
+              <w:rPr>
+                <w:rFonts w:ascii="Consolas" w:cs="Consolas" w:eastAsia="Consolas" w:hAnsi="Consolas"/>
+                <w:b w:val="false"/>
+                <w:bCs w:val="false"/>
+                <w:color w:val="1A1A1A"/>
+                <w:sz w:val="18"/>
+                <w:szCs w:val="18"/>
+              </w:rPr>
+              <w:t xml:space="preserve">15 real videos for “HVAC dispatch software” (market/competitor signal)</w:t>
+            </w:r>
+          </w:p>
+        </w:tc>
+      </w:tr>
+      <w:tr>
+        <w:tc>
+          <w:tcPr>
+            <w:tcW w:type="dxa" w:w="2400"/>
+            <w:tcMar>
+              <w:top w:type="dxa" w:w="60"/>
+              <w:left w:type="dxa" w:w="100"/>
+              <w:bottom w:type="dxa" w:w="60"/>
+              <w:right w:type="dxa" w:w="100"/>
+            </w:tcMar>
+          </w:tcPr>
+          <w:p>
+            <w:pPr>
+              <w:jc w:val="left"/>
+            </w:pPr>
+            <w:r>
+              <w:rPr>
+                <w:b w:val="false"/>
+                <w:bCs w:val="false"/>
+                <w:color w:val="1A1A1A"/>
+                <w:sz w:val="20"/>
+                <w:szCs w:val="20"/>
+              </w:rPr>
+              <w:t xml:space="preserve">BEA Regional</w:t>
+            </w:r>
+          </w:p>
+        </w:tc>
+        <w:tc>
+          <w:tcPr>
+            <w:tcW w:type="dxa" w:w="1600"/>
+            <w:tcMar>
+              <w:top w:type="dxa" w:w="60"/>
+              <w:left w:type="dxa" w:w="100"/>
+              <w:bottom w:type="dxa" w:w="60"/>
+              <w:right w:type="dxa" w:w="100"/>
+            </w:tcMar>
+          </w:tcPr>
+          <w:p>
+            <w:pPr>
+              <w:jc w:val="left"/>
+            </w:pPr>
+            <w:r>
+              <w:rPr>
+                <w:rFonts w:ascii="Consolas" w:cs="Consolas" w:eastAsia="Consolas" w:hAnsi="Consolas"/>
+                <w:b w:val="false"/>
+                <w:bCs w:val="false"/>
+                <w:color w:val="1A1A1A"/>
+                <w:sz w:val="18"/>
+                <w:szCs w:val="18"/>
+              </w:rPr>
+              <w:t xml:space="preserve">SKIPPED</w:t>
+            </w:r>
+          </w:p>
+        </w:tc>
+        <w:tc>
+          <w:tcPr>
+            <w:tcW w:type="dxa" w:w="5360"/>
+            <w:tcMar>
+              <w:top w:type="dxa" w:w="60"/>
+              <w:left w:type="dxa" w:w="100"/>
+              <w:bottom w:type="dxa" w:w="60"/>
+              <w:right w:type="dxa" w:w="100"/>
+            </w:tcMar>
+          </w:tcPr>
+          <w:p>
+            <w:pPr>
+              <w:jc w:val="left"/>
+            </w:pPr>
+            <w:r>
+              <w:rPr>
+                <w:rFonts w:ascii="Consolas" w:cs="Consolas" w:eastAsia="Consolas" w:hAnsi="Consolas"/>
+                <w:b w:val="false"/>
+                <w:bCs w:val="false"/>
+                <w:color w:val="1A1A1A"/>
+                <w:sz w:val="18"/>
+                <w:szCs w:val="18"/>
+              </w:rPr>
+              <w:t xml:space="preserve">us_hvac_10_99 defines no target region yet — BEA Regional needs one</w:t>
+            </w:r>
+          </w:p>
+        </w:tc>
+      </w:tr>
+      <w:tr>
+        <w:tc>
+          <w:tcPr>
+            <w:tcW w:type="dxa" w:w="2400"/>
+            <w:tcMar>
+              <w:top w:type="dxa" w:w="60"/>
+              <w:left w:type="dxa" w:w="100"/>
+              <w:bottom w:type="dxa" w:w="60"/>
+              <w:right w:type="dxa" w:w="100"/>
+            </w:tcMar>
+          </w:tcPr>
+          <w:p>
+            <w:pPr>
+              <w:jc w:val="left"/>
+            </w:pPr>
+            <w:r>
+              <w:rPr>
+                <w:b w:val="false"/>
+                <w:bCs w:val="false"/>
+                <w:color w:val="1A1A1A"/>
+                <w:sz w:val="20"/>
+                <w:szCs w:val="20"/>
+              </w:rPr>
+              <w:t xml:space="preserve">Common Crawl</w:t>
+            </w:r>
+          </w:p>
+        </w:tc>
+        <w:tc>
+          <w:tcPr>
+            <w:tcW w:type="dxa" w:w="1600"/>
+            <w:tcMar>
+              <w:top w:type="dxa" w:w="60"/>
+              <w:left w:type="dxa" w:w="100"/>
+              <w:bottom w:type="dxa" w:w="60"/>
+              <w:right w:type="dxa" w:w="100"/>
+            </w:tcMar>
+          </w:tcPr>
+          <w:p>
+            <w:pPr>
+              <w:jc w:val="left"/>
+            </w:pPr>
+            <w:r>
+              <w:rPr>
+                <w:rFonts w:ascii="Consolas" w:cs="Consolas" w:eastAsia="Consolas" w:hAnsi="Consolas"/>
+                <w:b w:val="false"/>
+                <w:bCs w:val="false"/>
+                <w:color w:val="1A1A1A"/>
+                <w:sz w:val="18"/>
+                <w:szCs w:val="18"/>
+              </w:rPr>
+              <w:t xml:space="preserve">SKIPPED</w:t>
+            </w:r>
+          </w:p>
+        </w:tc>
+        <w:tc>
+          <w:tcPr>
+            <w:tcW w:type="dxa" w:w="5360"/>
+            <w:tcMar>
+              <w:top w:type="dxa" w:w="60"/>
+              <w:left w:type="dxa" w:w="100"/>
+              <w:bottom w:type="dxa" w:w="60"/>
+              <w:right w:type="dxa" w:w="100"/>
+            </w:tcMar>
+          </w:tcPr>
+          <w:p>
+            <w:pPr>
+              <w:jc w:val="left"/>
+            </w:pPr>
+            <w:r>
+              <w:rPr>
+                <w:rFonts w:ascii="Consolas" w:cs="Consolas" w:eastAsia="Consolas" w:hAnsi="Consolas"/>
+                <w:b w:val="false"/>
+                <w:bCs w:val="false"/>
+                <w:color w:val="1A1A1A"/>
+                <w:sz w:val="18"/>
+                <w:szCs w:val="18"/>
+              </w:rPr>
+              <w:t xml:space="preserve">no approved SourcePolicy for a specific HVAC-industry URL exists yet</w:t>
+            </w:r>
+          </w:p>
+        </w:tc>
+      </w:tr>
+    </w:tbl>
+    <w:p>
+      <w:pPr>
+        <w:pStyle w:val="Heading1"/>
+        <w:spacing w:after="160" w:before="360"/>
+      </w:pPr>
+      <w:r>
+        <w:t xml:space="preserve">10. BLS — Employment Trend</w:t>
       </w:r>
     </w:p>
     <w:p>
@@ -3824,7 +4643,7 @@
         <w:spacing w:after="140"/>
       </w:pPr>
       <w:r>
-        <w:t xml:space="preserve">This entire report can be regenerated from a clean checkout by anyone with a free Census API key:</w:t>
+        <w:t xml:space="preserve">Source: Bureau of Labor Statistics, Current Employment Statistics (CES) public API (keyless).</w:t>
       </w:r>
     </w:p>
     <w:p>
@@ -3837,7 +4656,7 @@
           <w:sz w:val="19"/>
           <w:szCs w:val="19"/>
         </w:rPr>
-        <w:t xml:space="preserve">1. Set MASK_CENSUS_API_KEY in .env.official.local</w:t>
+        <w:t xml:space="preserve">Series: CES2023800001 — Specialty Trade Contractors, All Employees, Thousands</w:t>
       </w:r>
     </w:p>
     <w:p>
@@ -3850,7 +4669,7 @@
           <w:sz w:val="19"/>
           <w:szCs w:val="19"/>
         </w:rPr>
-        <w:t xml:space="preserve">2. cd apps/api &amp;&amp; uv run python ../../scripts/run_census_m1.py</w:t>
+        <w:t xml:space="preserve">Endpoint: https://api.bls.gov/publicAPI/v2/timeseries/data/</w:t>
       </w:r>
     </w:p>
     <w:p>
@@ -3858,7 +4677,1765 @@
         <w:spacing w:after="140"/>
       </w:pPr>
       <w:r>
-        <w:t xml:space="preserve">The script prints the exact JSON payload this report is built from, and writes the 9 real raw Census API responses to outputs/runs/m1_census_&lt;timestamp&gt;/raw/official_data/census_cbp/ for independent inspection.</w:t>
+        <w:t xml:space="preserve">36 real monthly observations retrieved (2023–2025). Most recent real value: 5,222.4 thousand employees nationally (Specialty Trade Contractors, December 2025) — the broader trade category NAICS 238220 sits inside, tracked as a real, independent employment-trend signal alongside Census CBP’s own establishment-level growth_cagr in Part A.</w:t>
+      </w:r>
+    </w:p>
+    <w:p>
+      <w:pPr>
+        <w:spacing w:after="140"/>
+      </w:pPr>
+      <w:r>
+        <w:t xml:space="preserve">A second real BLS series was separately verified live for this project’s M4 work: CES2000000003 (Construction supersector, Average Hourly Earnings of All Employees) — $35.60/hour, 2023-M01 — see AUTONOMOUS-041 for why it could not honestly be combined into a dollar economic-burden figure without a real hours-lost quantity to multiply it by.</w:t>
+      </w:r>
+    </w:p>
+    <w:p>
+      <w:pPr>
+        <w:pStyle w:val="Heading1"/>
+        <w:spacing w:after="160" w:before="360"/>
+      </w:pPr>
+      <w:r>
+        <w:t xml:space="preserve">11. SEC EDGAR — Public-Company Filings</w:t>
+      </w:r>
+    </w:p>
+    <w:p>
+      <w:pPr>
+        <w:spacing w:after="140"/>
+      </w:pPr>
+      <w:r>
+        <w:t xml:space="preserve">Source: SEC EDGAR full-text/submissions API (keyless, requires only a declared contact user-agent).</w:t>
+      </w:r>
+    </w:p>
+    <w:p>
+      <w:pPr>
+        <w:spacing w:after="80"/>
+      </w:pPr>
+      <w:r>
+        <w:rPr>
+          <w:rFonts w:ascii="Consolas" w:cs="Consolas" w:eastAsia="Consolas" w:hAnsi="Consolas"/>
+          <w:sz w:val="19"/>
+          <w:szCs w:val="19"/>
+        </w:rPr>
+        <w:t xml:space="preserve">Company: Comfort Systems USA Inc (NYSE: FIX), CIK 0001035983</w:t>
+      </w:r>
+    </w:p>
+    <w:p>
+      <w:pPr>
+        <w:spacing w:after="140"/>
+      </w:pPr>
+      <w:r>
+        <w:t xml:space="preserve">Comfort Systems USA is a real, publicly traded, national mechanical/HVAC-services company — verified against SEC’s own company_tickers.json before use. It is not a small 10–99-employee target-band business itself; it is used as a real, independently reportable proxy for how HVAC/mechanical-services economics are disclosed publicly (insider trading activity, 8-Ks, quarterly/annual results), not as evidence about the target band directly.</w:t>
+      </w:r>
+    </w:p>
+    <w:p>
+      <w:pPr>
+        <w:spacing w:after="140"/>
+      </w:pPr>
+      <w:r>
+        <w:t xml:space="preserve">1,000 real filings retrieved. Real form-type breakdown (top entries):</w:t>
+      </w:r>
+    </w:p>
+    <w:tbl>
+      <w:tblPr>
+        <w:tblW w:type="dxa" w:w="9360"/>
+        <w:tblBorders>
+          <w:top w:val="single" w:color="auto" w:sz="4"/>
+          <w:left w:val="single" w:color="auto" w:sz="4"/>
+          <w:bottom w:val="single" w:color="auto" w:sz="4"/>
+          <w:right w:val="single" w:color="auto" w:sz="4"/>
+          <w:insideH w:val="single" w:color="auto" w:sz="4"/>
+          <w:insideV w:val="single" w:color="auto" w:sz="4"/>
+        </w:tblBorders>
+      </w:tblPr>
+      <w:tblGrid>
+        <w:gridCol w:w="2800"/>
+        <w:gridCol w:w="1400"/>
+        <w:gridCol w:w="5160"/>
+      </w:tblGrid>
+      <w:tr>
+        <w:trPr>
+          <w:tblHeader/>
+        </w:trPr>
+        <w:tc>
+          <w:tcPr>
+            <w:tcW w:type="dxa" w:w="2800"/>
+            <w:shd w:fill="1F3B57" w:val="clear"/>
+            <w:tcMar>
+              <w:top w:type="dxa" w:w="60"/>
+              <w:left w:type="dxa" w:w="100"/>
+              <w:bottom w:type="dxa" w:w="60"/>
+              <w:right w:type="dxa" w:w="100"/>
+            </w:tcMar>
+          </w:tcPr>
+          <w:p>
+            <w:pPr>
+              <w:jc w:val="left"/>
+            </w:pPr>
+            <w:r>
+              <w:rPr>
+                <w:b/>
+                <w:bCs/>
+                <w:color w:val="FFFFFF"/>
+                <w:sz w:val="20"/>
+                <w:szCs w:val="20"/>
+              </w:rPr>
+              <w:t xml:space="preserve">Form type</w:t>
+            </w:r>
+          </w:p>
+        </w:tc>
+        <w:tc>
+          <w:tcPr>
+            <w:tcW w:type="dxa" w:w="1400"/>
+            <w:shd w:fill="1F3B57" w:val="clear"/>
+            <w:tcMar>
+              <w:top w:type="dxa" w:w="60"/>
+              <w:left w:type="dxa" w:w="100"/>
+              <w:bottom w:type="dxa" w:w="60"/>
+              <w:right w:type="dxa" w:w="100"/>
+            </w:tcMar>
+          </w:tcPr>
+          <w:p>
+            <w:pPr>
+              <w:jc w:val="left"/>
+            </w:pPr>
+            <w:r>
+              <w:rPr>
+                <w:b/>
+                <w:bCs/>
+                <w:color w:val="FFFFFF"/>
+                <w:sz w:val="20"/>
+                <w:szCs w:val="20"/>
+              </w:rPr>
+              <w:t xml:space="preserve">Count</w:t>
+            </w:r>
+          </w:p>
+        </w:tc>
+        <w:tc>
+          <w:tcPr>
+            <w:tcW w:type="dxa" w:w="5160"/>
+            <w:shd w:fill="1F3B57" w:val="clear"/>
+            <w:tcMar>
+              <w:top w:type="dxa" w:w="60"/>
+              <w:left w:type="dxa" w:w="100"/>
+              <w:bottom w:type="dxa" w:w="60"/>
+              <w:right w:type="dxa" w:w="100"/>
+            </w:tcMar>
+          </w:tcPr>
+          <w:p>
+            <w:pPr>
+              <w:jc w:val="left"/>
+            </w:pPr>
+            <w:r>
+              <w:rPr>
+                <w:b/>
+                <w:bCs/>
+                <w:color w:val="FFFFFF"/>
+                <w:sz w:val="20"/>
+                <w:szCs w:val="20"/>
+              </w:rPr>
+              <w:t xml:space="preserve">What it is</w:t>
+            </w:r>
+          </w:p>
+        </w:tc>
+      </w:tr>
+      <w:tr>
+        <w:tc>
+          <w:tcPr>
+            <w:tcW w:type="dxa" w:w="2800"/>
+            <w:tcMar>
+              <w:top w:type="dxa" w:w="60"/>
+              <w:left w:type="dxa" w:w="100"/>
+              <w:bottom w:type="dxa" w:w="60"/>
+              <w:right w:type="dxa" w:w="100"/>
+            </w:tcMar>
+          </w:tcPr>
+          <w:p>
+            <w:pPr>
+              <w:jc w:val="left"/>
+            </w:pPr>
+            <w:r>
+              <w:rPr>
+                <w:b w:val="false"/>
+                <w:bCs w:val="false"/>
+                <w:color w:val="1A1A1A"/>
+                <w:sz w:val="20"/>
+                <w:szCs w:val="20"/>
+              </w:rPr>
+              <w:t xml:space="preserve">4</w:t>
+            </w:r>
+          </w:p>
+        </w:tc>
+        <w:tc>
+          <w:tcPr>
+            <w:tcW w:type="dxa" w:w="1400"/>
+            <w:tcMar>
+              <w:top w:type="dxa" w:w="60"/>
+              <w:left w:type="dxa" w:w="100"/>
+              <w:bottom w:type="dxa" w:w="60"/>
+              <w:right w:type="dxa" w:w="100"/>
+            </w:tcMar>
+          </w:tcPr>
+          <w:p>
+            <w:pPr>
+              <w:jc w:val="left"/>
+            </w:pPr>
+            <w:r>
+              <w:rPr>
+                <w:rFonts w:ascii="Consolas" w:cs="Consolas" w:eastAsia="Consolas" w:hAnsi="Consolas"/>
+                <w:b w:val="false"/>
+                <w:bCs w:val="false"/>
+                <w:color w:val="1A1A1A"/>
+                <w:sz w:val="18"/>
+                <w:szCs w:val="18"/>
+              </w:rPr>
+              <w:t xml:space="preserve">558</w:t>
+            </w:r>
+          </w:p>
+        </w:tc>
+        <w:tc>
+          <w:tcPr>
+            <w:tcW w:type="dxa" w:w="5160"/>
+            <w:tcMar>
+              <w:top w:type="dxa" w:w="60"/>
+              <w:left w:type="dxa" w:w="100"/>
+              <w:bottom w:type="dxa" w:w="60"/>
+              <w:right w:type="dxa" w:w="100"/>
+            </w:tcMar>
+          </w:tcPr>
+          <w:p>
+            <w:pPr>
+              <w:jc w:val="left"/>
+            </w:pPr>
+            <w:r>
+              <w:rPr>
+                <w:rFonts w:ascii="Consolas" w:cs="Consolas" w:eastAsia="Consolas" w:hAnsi="Consolas"/>
+                <w:b w:val="false"/>
+                <w:bCs w:val="false"/>
+                <w:color w:val="1A1A1A"/>
+                <w:sz w:val="18"/>
+                <w:szCs w:val="18"/>
+              </w:rPr>
+              <w:t xml:space="preserve">Insider (officer/director) trading reports</w:t>
+            </w:r>
+          </w:p>
+        </w:tc>
+      </w:tr>
+      <w:tr>
+        <w:tc>
+          <w:tcPr>
+            <w:tcW w:type="dxa" w:w="2800"/>
+            <w:tcMar>
+              <w:top w:type="dxa" w:w="60"/>
+              <w:left w:type="dxa" w:w="100"/>
+              <w:bottom w:type="dxa" w:w="60"/>
+              <w:right w:type="dxa" w:w="100"/>
+            </w:tcMar>
+          </w:tcPr>
+          <w:p>
+            <w:pPr>
+              <w:jc w:val="left"/>
+            </w:pPr>
+            <w:r>
+              <w:rPr>
+                <w:b w:val="false"/>
+                <w:bCs w:val="false"/>
+                <w:color w:val="1A1A1A"/>
+                <w:sz w:val="20"/>
+                <w:szCs w:val="20"/>
+              </w:rPr>
+              <w:t xml:space="preserve">8-K</w:t>
+            </w:r>
+          </w:p>
+        </w:tc>
+        <w:tc>
+          <w:tcPr>
+            <w:tcW w:type="dxa" w:w="1400"/>
+            <w:tcMar>
+              <w:top w:type="dxa" w:w="60"/>
+              <w:left w:type="dxa" w:w="100"/>
+              <w:bottom w:type="dxa" w:w="60"/>
+              <w:right w:type="dxa" w:w="100"/>
+            </w:tcMar>
+          </w:tcPr>
+          <w:p>
+            <w:pPr>
+              <w:jc w:val="left"/>
+            </w:pPr>
+            <w:r>
+              <w:rPr>
+                <w:rFonts w:ascii="Consolas" w:cs="Consolas" w:eastAsia="Consolas" w:hAnsi="Consolas"/>
+                <w:b w:val="false"/>
+                <w:bCs w:val="false"/>
+                <w:color w:val="1A1A1A"/>
+                <w:sz w:val="18"/>
+                <w:szCs w:val="18"/>
+              </w:rPr>
+              <w:t xml:space="preserve">163</w:t>
+            </w:r>
+          </w:p>
+        </w:tc>
+        <w:tc>
+          <w:tcPr>
+            <w:tcW w:type="dxa" w:w="5160"/>
+            <w:tcMar>
+              <w:top w:type="dxa" w:w="60"/>
+              <w:left w:type="dxa" w:w="100"/>
+              <w:bottom w:type="dxa" w:w="60"/>
+              <w:right w:type="dxa" w:w="100"/>
+            </w:tcMar>
+          </w:tcPr>
+          <w:p>
+            <w:pPr>
+              <w:jc w:val="left"/>
+            </w:pPr>
+            <w:r>
+              <w:rPr>
+                <w:rFonts w:ascii="Consolas" w:cs="Consolas" w:eastAsia="Consolas" w:hAnsi="Consolas"/>
+                <w:b w:val="false"/>
+                <w:bCs w:val="false"/>
+                <w:color w:val="1A1A1A"/>
+                <w:sz w:val="18"/>
+                <w:szCs w:val="18"/>
+              </w:rPr>
+              <w:t xml:space="preserve">Material corporate events</w:t>
+            </w:r>
+          </w:p>
+        </w:tc>
+      </w:tr>
+      <w:tr>
+        <w:tc>
+          <w:tcPr>
+            <w:tcW w:type="dxa" w:w="2800"/>
+            <w:tcMar>
+              <w:top w:type="dxa" w:w="60"/>
+              <w:left w:type="dxa" w:w="100"/>
+              <w:bottom w:type="dxa" w:w="60"/>
+              <w:right w:type="dxa" w:w="100"/>
+            </w:tcMar>
+          </w:tcPr>
+          <w:p>
+            <w:pPr>
+              <w:jc w:val="left"/>
+            </w:pPr>
+            <w:r>
+              <w:rPr>
+                <w:b w:val="false"/>
+                <w:bCs w:val="false"/>
+                <w:color w:val="1A1A1A"/>
+                <w:sz w:val="20"/>
+                <w:szCs w:val="20"/>
+              </w:rPr>
+              <w:t xml:space="preserve">144</w:t>
+            </w:r>
+          </w:p>
+        </w:tc>
+        <w:tc>
+          <w:tcPr>
+            <w:tcW w:type="dxa" w:w="1400"/>
+            <w:tcMar>
+              <w:top w:type="dxa" w:w="60"/>
+              <w:left w:type="dxa" w:w="100"/>
+              <w:bottom w:type="dxa" w:w="60"/>
+              <w:right w:type="dxa" w:w="100"/>
+            </w:tcMar>
+          </w:tcPr>
+          <w:p>
+            <w:pPr>
+              <w:jc w:val="left"/>
+            </w:pPr>
+            <w:r>
+              <w:rPr>
+                <w:rFonts w:ascii="Consolas" w:cs="Consolas" w:eastAsia="Consolas" w:hAnsi="Consolas"/>
+                <w:b w:val="false"/>
+                <w:bCs w:val="false"/>
+                <w:color w:val="1A1A1A"/>
+                <w:sz w:val="18"/>
+                <w:szCs w:val="18"/>
+              </w:rPr>
+              <w:t xml:space="preserve">95</w:t>
+            </w:r>
+          </w:p>
+        </w:tc>
+        <w:tc>
+          <w:tcPr>
+            <w:tcW w:type="dxa" w:w="5160"/>
+            <w:tcMar>
+              <w:top w:type="dxa" w:w="60"/>
+              <w:left w:type="dxa" w:w="100"/>
+              <w:bottom w:type="dxa" w:w="60"/>
+              <w:right w:type="dxa" w:w="100"/>
+            </w:tcMar>
+          </w:tcPr>
+          <w:p>
+            <w:pPr>
+              <w:jc w:val="left"/>
+            </w:pPr>
+            <w:r>
+              <w:rPr>
+                <w:rFonts w:ascii="Consolas" w:cs="Consolas" w:eastAsia="Consolas" w:hAnsi="Consolas"/>
+                <w:b w:val="false"/>
+                <w:bCs w:val="false"/>
+                <w:color w:val="1A1A1A"/>
+                <w:sz w:val="18"/>
+                <w:szCs w:val="18"/>
+              </w:rPr>
+              <w:t xml:space="preserve">Proposed sale of restricted securities</w:t>
+            </w:r>
+          </w:p>
+        </w:tc>
+      </w:tr>
+      <w:tr>
+        <w:tc>
+          <w:tcPr>
+            <w:tcW w:type="dxa" w:w="2800"/>
+            <w:tcMar>
+              <w:top w:type="dxa" w:w="60"/>
+              <w:left w:type="dxa" w:w="100"/>
+              <w:bottom w:type="dxa" w:w="60"/>
+              <w:right w:type="dxa" w:w="100"/>
+            </w:tcMar>
+          </w:tcPr>
+          <w:p>
+            <w:pPr>
+              <w:jc w:val="left"/>
+            </w:pPr>
+            <w:r>
+              <w:rPr>
+                <w:b w:val="false"/>
+                <w:bCs w:val="false"/>
+                <w:color w:val="1A1A1A"/>
+                <w:sz w:val="20"/>
+                <w:szCs w:val="20"/>
+              </w:rPr>
+              <w:t xml:space="preserve">SC 13G/A</w:t>
+            </w:r>
+          </w:p>
+        </w:tc>
+        <w:tc>
+          <w:tcPr>
+            <w:tcW w:type="dxa" w:w="1400"/>
+            <w:tcMar>
+              <w:top w:type="dxa" w:w="60"/>
+              <w:left w:type="dxa" w:w="100"/>
+              <w:bottom w:type="dxa" w:w="60"/>
+              <w:right w:type="dxa" w:w="100"/>
+            </w:tcMar>
+          </w:tcPr>
+          <w:p>
+            <w:pPr>
+              <w:jc w:val="left"/>
+            </w:pPr>
+            <w:r>
+              <w:rPr>
+                <w:rFonts w:ascii="Consolas" w:cs="Consolas" w:eastAsia="Consolas" w:hAnsi="Consolas"/>
+                <w:b w:val="false"/>
+                <w:bCs w:val="false"/>
+                <w:color w:val="1A1A1A"/>
+                <w:sz w:val="18"/>
+                <w:szCs w:val="18"/>
+              </w:rPr>
+              <w:t xml:space="preserve">42</w:t>
+            </w:r>
+          </w:p>
+        </w:tc>
+        <w:tc>
+          <w:tcPr>
+            <w:tcW w:type="dxa" w:w="5160"/>
+            <w:tcMar>
+              <w:top w:type="dxa" w:w="60"/>
+              <w:left w:type="dxa" w:w="100"/>
+              <w:bottom w:type="dxa" w:w="60"/>
+              <w:right w:type="dxa" w:w="100"/>
+            </w:tcMar>
+          </w:tcPr>
+          <w:p>
+            <w:pPr>
+              <w:jc w:val="left"/>
+            </w:pPr>
+            <w:r>
+              <w:rPr>
+                <w:rFonts w:ascii="Consolas" w:cs="Consolas" w:eastAsia="Consolas" w:hAnsi="Consolas"/>
+                <w:b w:val="false"/>
+                <w:bCs w:val="false"/>
+                <w:color w:val="1A1A1A"/>
+                <w:sz w:val="18"/>
+                <w:szCs w:val="18"/>
+              </w:rPr>
+              <w:t xml:space="preserve">Beneficial-ownership amendments</w:t>
+            </w:r>
+          </w:p>
+        </w:tc>
+      </w:tr>
+      <w:tr>
+        <w:tc>
+          <w:tcPr>
+            <w:tcW w:type="dxa" w:w="2800"/>
+            <w:tcMar>
+              <w:top w:type="dxa" w:w="60"/>
+              <w:left w:type="dxa" w:w="100"/>
+              <w:bottom w:type="dxa" w:w="60"/>
+              <w:right w:type="dxa" w:w="100"/>
+            </w:tcMar>
+          </w:tcPr>
+          <w:p>
+            <w:pPr>
+              <w:jc w:val="left"/>
+            </w:pPr>
+            <w:r>
+              <w:rPr>
+                <w:b w:val="false"/>
+                <w:bCs w:val="false"/>
+                <w:color w:val="1A1A1A"/>
+                <w:sz w:val="20"/>
+                <w:szCs w:val="20"/>
+              </w:rPr>
+              <w:t xml:space="preserve">10-Q</w:t>
+            </w:r>
+          </w:p>
+        </w:tc>
+        <w:tc>
+          <w:tcPr>
+            <w:tcW w:type="dxa" w:w="1400"/>
+            <w:tcMar>
+              <w:top w:type="dxa" w:w="60"/>
+              <w:left w:type="dxa" w:w="100"/>
+              <w:bottom w:type="dxa" w:w="60"/>
+              <w:right w:type="dxa" w:w="100"/>
+            </w:tcMar>
+          </w:tcPr>
+          <w:p>
+            <w:pPr>
+              <w:jc w:val="left"/>
+            </w:pPr>
+            <w:r>
+              <w:rPr>
+                <w:rFonts w:ascii="Consolas" w:cs="Consolas" w:eastAsia="Consolas" w:hAnsi="Consolas"/>
+                <w:b w:val="false"/>
+                <w:bCs w:val="false"/>
+                <w:color w:val="1A1A1A"/>
+                <w:sz w:val="18"/>
+                <w:szCs w:val="18"/>
+              </w:rPr>
+              <w:t xml:space="preserve">41</w:t>
+            </w:r>
+          </w:p>
+        </w:tc>
+        <w:tc>
+          <w:tcPr>
+            <w:tcW w:type="dxa" w:w="5160"/>
+            <w:tcMar>
+              <w:top w:type="dxa" w:w="60"/>
+              <w:left w:type="dxa" w:w="100"/>
+              <w:bottom w:type="dxa" w:w="60"/>
+              <w:right w:type="dxa" w:w="100"/>
+            </w:tcMar>
+          </w:tcPr>
+          <w:p>
+            <w:pPr>
+              <w:jc w:val="left"/>
+            </w:pPr>
+            <w:r>
+              <w:rPr>
+                <w:rFonts w:ascii="Consolas" w:cs="Consolas" w:eastAsia="Consolas" w:hAnsi="Consolas"/>
+                <w:b w:val="false"/>
+                <w:bCs w:val="false"/>
+                <w:color w:val="1A1A1A"/>
+                <w:sz w:val="18"/>
+                <w:szCs w:val="18"/>
+              </w:rPr>
+              <w:t xml:space="preserve">Quarterly reports</w:t>
+            </w:r>
+          </w:p>
+        </w:tc>
+      </w:tr>
+      <w:tr>
+        <w:tc>
+          <w:tcPr>
+            <w:tcW w:type="dxa" w:w="2800"/>
+            <w:tcMar>
+              <w:top w:type="dxa" w:w="60"/>
+              <w:left w:type="dxa" w:w="100"/>
+              <w:bottom w:type="dxa" w:w="60"/>
+              <w:right w:type="dxa" w:w="100"/>
+            </w:tcMar>
+          </w:tcPr>
+          <w:p>
+            <w:pPr>
+              <w:jc w:val="left"/>
+            </w:pPr>
+            <w:r>
+              <w:rPr>
+                <w:b w:val="false"/>
+                <w:bCs w:val="false"/>
+                <w:color w:val="1A1A1A"/>
+                <w:sz w:val="20"/>
+                <w:szCs w:val="20"/>
+              </w:rPr>
+              <w:t xml:space="preserve">DEF 14A</w:t>
+            </w:r>
+          </w:p>
+        </w:tc>
+        <w:tc>
+          <w:tcPr>
+            <w:tcW w:type="dxa" w:w="1400"/>
+            <w:tcMar>
+              <w:top w:type="dxa" w:w="60"/>
+              <w:left w:type="dxa" w:w="100"/>
+              <w:bottom w:type="dxa" w:w="60"/>
+              <w:right w:type="dxa" w:w="100"/>
+            </w:tcMar>
+          </w:tcPr>
+          <w:p>
+            <w:pPr>
+              <w:jc w:val="left"/>
+            </w:pPr>
+            <w:r>
+              <w:rPr>
+                <w:rFonts w:ascii="Consolas" w:cs="Consolas" w:eastAsia="Consolas" w:hAnsi="Consolas"/>
+                <w:b w:val="false"/>
+                <w:bCs w:val="false"/>
+                <w:color w:val="1A1A1A"/>
+                <w:sz w:val="18"/>
+                <w:szCs w:val="18"/>
+              </w:rPr>
+              <w:t xml:space="preserve">14</w:t>
+            </w:r>
+          </w:p>
+        </w:tc>
+        <w:tc>
+          <w:tcPr>
+            <w:tcW w:type="dxa" w:w="5160"/>
+            <w:tcMar>
+              <w:top w:type="dxa" w:w="60"/>
+              <w:left w:type="dxa" w:w="100"/>
+              <w:bottom w:type="dxa" w:w="60"/>
+              <w:right w:type="dxa" w:w="100"/>
+            </w:tcMar>
+          </w:tcPr>
+          <w:p>
+            <w:pPr>
+              <w:jc w:val="left"/>
+            </w:pPr>
+            <w:r>
+              <w:rPr>
+                <w:rFonts w:ascii="Consolas" w:cs="Consolas" w:eastAsia="Consolas" w:hAnsi="Consolas"/>
+                <w:b w:val="false"/>
+                <w:bCs w:val="false"/>
+                <w:color w:val="1A1A1A"/>
+                <w:sz w:val="18"/>
+                <w:szCs w:val="18"/>
+              </w:rPr>
+              <w:t xml:space="preserve">Proxy statements</w:t>
+            </w:r>
+          </w:p>
+        </w:tc>
+      </w:tr>
+      <w:tr>
+        <w:tc>
+          <w:tcPr>
+            <w:tcW w:type="dxa" w:w="2800"/>
+            <w:tcMar>
+              <w:top w:type="dxa" w:w="60"/>
+              <w:left w:type="dxa" w:w="100"/>
+              <w:bottom w:type="dxa" w:w="60"/>
+              <w:right w:type="dxa" w:w="100"/>
+            </w:tcMar>
+          </w:tcPr>
+          <w:p>
+            <w:pPr>
+              <w:jc w:val="left"/>
+            </w:pPr>
+            <w:r>
+              <w:rPr>
+                <w:b w:val="false"/>
+                <w:bCs w:val="false"/>
+                <w:color w:val="1A1A1A"/>
+                <w:sz w:val="20"/>
+                <w:szCs w:val="20"/>
+              </w:rPr>
+              <w:t xml:space="preserve">10-K</w:t>
+            </w:r>
+          </w:p>
+        </w:tc>
+        <w:tc>
+          <w:tcPr>
+            <w:tcW w:type="dxa" w:w="1400"/>
+            <w:tcMar>
+              <w:top w:type="dxa" w:w="60"/>
+              <w:left w:type="dxa" w:w="100"/>
+              <w:bottom w:type="dxa" w:w="60"/>
+              <w:right w:type="dxa" w:w="100"/>
+            </w:tcMar>
+          </w:tcPr>
+          <w:p>
+            <w:pPr>
+              <w:jc w:val="left"/>
+            </w:pPr>
+            <w:r>
+              <w:rPr>
+                <w:rFonts w:ascii="Consolas" w:cs="Consolas" w:eastAsia="Consolas" w:hAnsi="Consolas"/>
+                <w:b w:val="false"/>
+                <w:bCs w:val="false"/>
+                <w:color w:val="1A1A1A"/>
+                <w:sz w:val="18"/>
+                <w:szCs w:val="18"/>
+              </w:rPr>
+              <w:t xml:space="preserve">13</w:t>
+            </w:r>
+          </w:p>
+        </w:tc>
+        <w:tc>
+          <w:tcPr>
+            <w:tcW w:type="dxa" w:w="5160"/>
+            <w:tcMar>
+              <w:top w:type="dxa" w:w="60"/>
+              <w:left w:type="dxa" w:w="100"/>
+              <w:bottom w:type="dxa" w:w="60"/>
+              <w:right w:type="dxa" w:w="100"/>
+            </w:tcMar>
+          </w:tcPr>
+          <w:p>
+            <w:pPr>
+              <w:jc w:val="left"/>
+            </w:pPr>
+            <w:r>
+              <w:rPr>
+                <w:rFonts w:ascii="Consolas" w:cs="Consolas" w:eastAsia="Consolas" w:hAnsi="Consolas"/>
+                <w:b w:val="false"/>
+                <w:bCs w:val="false"/>
+                <w:color w:val="1A1A1A"/>
+                <w:sz w:val="18"/>
+                <w:szCs w:val="18"/>
+              </w:rPr>
+              <w:t xml:space="preserve">Annual reports</w:t>
+            </w:r>
+          </w:p>
+        </w:tc>
+      </w:tr>
+    </w:tbl>
+    <w:p>
+      <w:pPr>
+        <w:pStyle w:val="Heading1"/>
+        <w:spacing w:after="160" w:before="360"/>
+      </w:pPr>
+      <w:r>
+        <w:t xml:space="preserve">12. SAM.gov — Federal Procurement Opportunities</w:t>
+      </w:r>
+    </w:p>
+    <w:p>
+      <w:pPr>
+        <w:spacing w:after="140"/>
+      </w:pPr>
+      <w:r>
+        <w:t xml:space="preserve">Source: SAM.gov Opportunities API (System for Award Management), real government contract solicitations/awards.</w:t>
+      </w:r>
+    </w:p>
+    <w:p>
+      <w:pPr>
+        <w:spacing w:after="80"/>
+      </w:pPr>
+      <w:r>
+        <w:rPr>
+          <w:rFonts w:ascii="Consolas" w:cs="Consolas" w:eastAsia="Consolas" w:hAnsi="Consolas"/>
+          <w:sz w:val="19"/>
+          <w:szCs w:val="19"/>
+        </w:rPr>
+        <w:t xml:space="preserve">Query: NAICS 238220, most recent 25 real opportunities</w:t>
+      </w:r>
+    </w:p>
+    <w:p>
+      <w:pPr>
+        <w:spacing w:after="140"/>
+      </w:pPr>
+      <w:r>
+        <w:t xml:space="preserve">Real, representative examples retrieved:</w:t>
+      </w:r>
+    </w:p>
+    <w:p>
+      <w:pPr>
+        <w:pStyle w:val="ListParagraph"/>
+        <w:numPr>
+          <w:ilvl w:val="0"/>
+          <w:numId w:val="1"/>
+        </w:numPr>
+        <w:spacing w:after="60"/>
+      </w:pPr>
+      <w:r>
+        <w:t xml:space="preserve">“Air Handling Unit Replacement” — NOAA — real award $288,118.00</w:t>
+      </w:r>
+    </w:p>
+    <w:p>
+      <w:pPr>
+        <w:pStyle w:val="ListParagraph"/>
+        <w:numPr>
+          <w:ilvl w:val="0"/>
+          <w:numId w:val="1"/>
+        </w:numPr>
+        <w:spacing w:after="60"/>
+      </w:pPr>
+      <w:r>
+        <w:t xml:space="preserve">“QHAV and Dehumidification Equipment… Mexican Fruit Fly Eclosion Center, Reynosa, Mexico” — USDA APHIS</w:t>
+      </w:r>
+    </w:p>
+    <w:p>
+      <w:pPr>
+        <w:pStyle w:val="ListParagraph"/>
+        <w:numPr>
+          <w:ilvl w:val="0"/>
+          <w:numId w:val="1"/>
+        </w:numPr>
+        <w:spacing w:after="60"/>
+      </w:pPr>
+      <w:r>
+        <w:t xml:space="preserve">“Remove and replace commercial water heaters” — US Coast Guard</w:t>
+      </w:r>
+    </w:p>
+    <w:p>
+      <w:pPr>
+        <w:pStyle w:val="ListParagraph"/>
+        <w:numPr>
+          <w:ilvl w:val="0"/>
+          <w:numId w:val="1"/>
+        </w:numPr>
+        <w:spacing w:after="60"/>
+      </w:pPr>
+      <w:r>
+        <w:t xml:space="preserve">“Backflow Preventer Upgrades” — US Army</w:t>
+      </w:r>
+    </w:p>
+    <w:p>
+      <w:pPr>
+        <w:spacing w:after="140"/>
+      </w:pPr>
+      <w:r>
+        <w:t xml:space="preserve">This confirms real federal demand exists for NAICS-238220 work, but SAM.gov opportunities are federal-buyer solicitations — not a directory of the target band’s own 10–99-employee businesses, and were not used for M7 buyer-accessibility for that reason (see AUTONOMOUS-043).</w:t>
+      </w:r>
+    </w:p>
+    <w:p>
+      <w:pPr>
+        <w:pStyle w:val="Heading1"/>
+        <w:spacing w:after="160" w:before="360"/>
+      </w:pPr>
+      <w:r>
+        <w:t xml:space="preserve">13. USAspending — Federal Contract Awards</w:t>
+      </w:r>
+    </w:p>
+    <w:p>
+      <w:pPr>
+        <w:spacing w:after="140"/>
+      </w:pPr>
+      <w:r>
+        <w:t xml:space="preserve">Source: USAspending.gov Award Search API (keyless), real historical federal contract awards.</w:t>
+      </w:r>
+    </w:p>
+    <w:p>
+      <w:pPr>
+        <w:spacing w:after="80"/>
+      </w:pPr>
+      <w:r>
+        <w:rPr>
+          <w:rFonts w:ascii="Consolas" w:cs="Consolas" w:eastAsia="Consolas" w:hAnsi="Consolas"/>
+          <w:sz w:val="19"/>
+          <w:szCs w:val="19"/>
+        </w:rPr>
+        <w:t xml:space="preserve">Query: NAICS 238220, most recent 25 real awards, 2015–2026</w:t>
+      </w:r>
+    </w:p>
+    <w:p>
+      <w:pPr>
+        <w:spacing w:after="140"/>
+      </w:pPr>
+      <w:r>
+        <w:t xml:space="preserve">Real combined award value across all 25 records: $642,710,097.93. Top 5 real awards:</w:t>
+      </w:r>
+    </w:p>
+    <w:tbl>
+      <w:tblPr>
+        <w:tblW w:type="dxa" w:w="9360"/>
+        <w:tblBorders>
+          <w:top w:val="single" w:color="auto" w:sz="4"/>
+          <w:left w:val="single" w:color="auto" w:sz="4"/>
+          <w:bottom w:val="single" w:color="auto" w:sz="4"/>
+          <w:right w:val="single" w:color="auto" w:sz="4"/>
+          <w:insideH w:val="single" w:color="auto" w:sz="4"/>
+          <w:insideV w:val="single" w:color="auto" w:sz="4"/>
+        </w:tblBorders>
+      </w:tblPr>
+      <w:tblGrid>
+        <w:gridCol w:w="2600"/>
+        <w:gridCol w:w="1900"/>
+        <w:gridCol w:w="1900"/>
+        <w:gridCol w:w="2960"/>
+      </w:tblGrid>
+      <w:tr>
+        <w:trPr>
+          <w:tblHeader/>
+        </w:trPr>
+        <w:tc>
+          <w:tcPr>
+            <w:tcW w:type="dxa" w:w="2600"/>
+            <w:shd w:fill="1F3B57" w:val="clear"/>
+            <w:tcMar>
+              <w:top w:type="dxa" w:w="60"/>
+              <w:left w:type="dxa" w:w="100"/>
+              <w:bottom w:type="dxa" w:w="60"/>
+              <w:right w:type="dxa" w:w="100"/>
+            </w:tcMar>
+          </w:tcPr>
+          <w:p>
+            <w:pPr>
+              <w:jc w:val="left"/>
+            </w:pPr>
+            <w:r>
+              <w:rPr>
+                <w:b/>
+                <w:bCs/>
+                <w:color w:val="FFFFFF"/>
+                <w:sz w:val="20"/>
+                <w:szCs w:val="20"/>
+              </w:rPr>
+              <w:t xml:space="preserve">Recipient</w:t>
+            </w:r>
+          </w:p>
+        </w:tc>
+        <w:tc>
+          <w:tcPr>
+            <w:tcW w:type="dxa" w:w="1900"/>
+            <w:shd w:fill="1F3B57" w:val="clear"/>
+            <w:tcMar>
+              <w:top w:type="dxa" w:w="60"/>
+              <w:left w:type="dxa" w:w="100"/>
+              <w:bottom w:type="dxa" w:w="60"/>
+              <w:right w:type="dxa" w:w="100"/>
+            </w:tcMar>
+          </w:tcPr>
+          <w:p>
+            <w:pPr>
+              <w:jc w:val="left"/>
+            </w:pPr>
+            <w:r>
+              <w:rPr>
+                <w:b/>
+                <w:bCs/>
+                <w:color w:val="FFFFFF"/>
+                <w:sz w:val="20"/>
+                <w:szCs w:val="20"/>
+              </w:rPr>
+              <w:t xml:space="preserve">Award amount</w:t>
+            </w:r>
+          </w:p>
+        </w:tc>
+        <w:tc>
+          <w:tcPr>
+            <w:tcW w:type="dxa" w:w="1900"/>
+            <w:shd w:fill="1F3B57" w:val="clear"/>
+            <w:tcMar>
+              <w:top w:type="dxa" w:w="60"/>
+              <w:left w:type="dxa" w:w="100"/>
+              <w:bottom w:type="dxa" w:w="60"/>
+              <w:right w:type="dxa" w:w="100"/>
+            </w:tcMar>
+          </w:tcPr>
+          <w:p>
+            <w:pPr>
+              <w:jc w:val="left"/>
+            </w:pPr>
+            <w:r>
+              <w:rPr>
+                <w:b/>
+                <w:bCs/>
+                <w:color w:val="FFFFFF"/>
+                <w:sz w:val="20"/>
+                <w:szCs w:val="20"/>
+              </w:rPr>
+              <w:t xml:space="preserve">Agency</w:t>
+            </w:r>
+          </w:p>
+        </w:tc>
+        <w:tc>
+          <w:tcPr>
+            <w:tcW w:type="dxa" w:w="2960"/>
+            <w:shd w:fill="1F3B57" w:val="clear"/>
+            <w:tcMar>
+              <w:top w:type="dxa" w:w="60"/>
+              <w:left w:type="dxa" w:w="100"/>
+              <w:bottom w:type="dxa" w:w="60"/>
+              <w:right w:type="dxa" w:w="100"/>
+            </w:tcMar>
+          </w:tcPr>
+          <w:p>
+            <w:pPr>
+              <w:jc w:val="left"/>
+            </w:pPr>
+            <w:r>
+              <w:rPr>
+                <w:b/>
+                <w:bCs/>
+                <w:color w:val="FFFFFF"/>
+                <w:sz w:val="20"/>
+                <w:szCs w:val="20"/>
+              </w:rPr>
+              <w:t xml:space="preserve">Description</w:t>
+            </w:r>
+          </w:p>
+        </w:tc>
+      </w:tr>
+      <w:tr>
+        <w:tc>
+          <w:tcPr>
+            <w:tcW w:type="dxa" w:w="2600"/>
+            <w:tcMar>
+              <w:top w:type="dxa" w:w="60"/>
+              <w:left w:type="dxa" w:w="100"/>
+              <w:bottom w:type="dxa" w:w="60"/>
+              <w:right w:type="dxa" w:w="100"/>
+            </w:tcMar>
+          </w:tcPr>
+          <w:p>
+            <w:pPr>
+              <w:jc w:val="left"/>
+            </w:pPr>
+            <w:r>
+              <w:rPr>
+                <w:b w:val="false"/>
+                <w:bCs w:val="false"/>
+                <w:color w:val="1A1A1A"/>
+                <w:sz w:val="20"/>
+                <w:szCs w:val="20"/>
+              </w:rPr>
+              <w:t xml:space="preserve">BLUEWAY ONE JV LLC</w:t>
+            </w:r>
+          </w:p>
+        </w:tc>
+        <w:tc>
+          <w:tcPr>
+            <w:tcW w:type="dxa" w:w="1900"/>
+            <w:tcMar>
+              <w:top w:type="dxa" w:w="60"/>
+              <w:left w:type="dxa" w:w="100"/>
+              <w:bottom w:type="dxa" w:w="60"/>
+              <w:right w:type="dxa" w:w="100"/>
+            </w:tcMar>
+          </w:tcPr>
+          <w:p>
+            <w:pPr>
+              <w:jc w:val="left"/>
+            </w:pPr>
+            <w:r>
+              <w:rPr>
+                <w:rFonts w:ascii="Consolas" w:cs="Consolas" w:eastAsia="Consolas" w:hAnsi="Consolas"/>
+                <w:b w:val="false"/>
+                <w:bCs w:val="false"/>
+                <w:color w:val="1A1A1A"/>
+                <w:sz w:val="18"/>
+                <w:szCs w:val="18"/>
+              </w:rPr>
+              <w:t xml:space="preserve">$48,924,250.74</w:t>
+            </w:r>
+          </w:p>
+        </w:tc>
+        <w:tc>
+          <w:tcPr>
+            <w:tcW w:type="dxa" w:w="1900"/>
+            <w:tcMar>
+              <w:top w:type="dxa" w:w="60"/>
+              <w:left w:type="dxa" w:w="100"/>
+              <w:bottom w:type="dxa" w:w="60"/>
+              <w:right w:type="dxa" w:w="100"/>
+            </w:tcMar>
+          </w:tcPr>
+          <w:p>
+            <w:pPr>
+              <w:jc w:val="left"/>
+            </w:pPr>
+            <w:r>
+              <w:rPr>
+                <w:rFonts w:ascii="Consolas" w:cs="Consolas" w:eastAsia="Consolas" w:hAnsi="Consolas"/>
+                <w:b w:val="false"/>
+                <w:bCs w:val="false"/>
+                <w:color w:val="1A1A1A"/>
+                <w:sz w:val="18"/>
+                <w:szCs w:val="18"/>
+              </w:rPr>
+              <w:t xml:space="preserve">Veterans Affairs</w:t>
+            </w:r>
+          </w:p>
+        </w:tc>
+        <w:tc>
+          <w:tcPr>
+            <w:tcW w:type="dxa" w:w="2960"/>
+            <w:tcMar>
+              <w:top w:type="dxa" w:w="60"/>
+              <w:left w:type="dxa" w:w="100"/>
+              <w:bottom w:type="dxa" w:w="60"/>
+              <w:right w:type="dxa" w:w="100"/>
+            </w:tcMar>
+          </w:tcPr>
+          <w:p>
+            <w:pPr>
+              <w:jc w:val="left"/>
+            </w:pPr>
+            <w:r>
+              <w:rPr>
+                <w:rFonts w:ascii="Consolas" w:cs="Consolas" w:eastAsia="Consolas" w:hAnsi="Consolas"/>
+                <w:b w:val="false"/>
+                <w:bCs w:val="false"/>
+                <w:color w:val="1A1A1A"/>
+                <w:sz w:val="18"/>
+                <w:szCs w:val="18"/>
+              </w:rPr>
+              <w:t xml:space="preserve">Replacement of boilers, Albany VAMC</w:t>
+            </w:r>
+          </w:p>
+        </w:tc>
+      </w:tr>
+      <w:tr>
+        <w:tc>
+          <w:tcPr>
+            <w:tcW w:type="dxa" w:w="2600"/>
+            <w:tcMar>
+              <w:top w:type="dxa" w:w="60"/>
+              <w:left w:type="dxa" w:w="100"/>
+              <w:bottom w:type="dxa" w:w="60"/>
+              <w:right w:type="dxa" w:w="100"/>
+            </w:tcMar>
+          </w:tcPr>
+          <w:p>
+            <w:pPr>
+              <w:jc w:val="left"/>
+            </w:pPr>
+            <w:r>
+              <w:rPr>
+                <w:b w:val="false"/>
+                <w:bCs w:val="false"/>
+                <w:color w:val="1A1A1A"/>
+                <w:sz w:val="20"/>
+                <w:szCs w:val="20"/>
+              </w:rPr>
+              <w:t xml:space="preserve">QCM, INC.</w:t>
+            </w:r>
+          </w:p>
+        </w:tc>
+        <w:tc>
+          <w:tcPr>
+            <w:tcW w:type="dxa" w:w="1900"/>
+            <w:tcMar>
+              <w:top w:type="dxa" w:w="60"/>
+              <w:left w:type="dxa" w:w="100"/>
+              <w:bottom w:type="dxa" w:w="60"/>
+              <w:right w:type="dxa" w:w="100"/>
+            </w:tcMar>
+          </w:tcPr>
+          <w:p>
+            <w:pPr>
+              <w:jc w:val="left"/>
+            </w:pPr>
+            <w:r>
+              <w:rPr>
+                <w:rFonts w:ascii="Consolas" w:cs="Consolas" w:eastAsia="Consolas" w:hAnsi="Consolas"/>
+                <w:b w:val="false"/>
+                <w:bCs w:val="false"/>
+                <w:color w:val="1A1A1A"/>
+                <w:sz w:val="18"/>
+                <w:szCs w:val="18"/>
+              </w:rPr>
+              <w:t xml:space="preserve">$41,921,348.61</w:t>
+            </w:r>
+          </w:p>
+        </w:tc>
+        <w:tc>
+          <w:tcPr>
+            <w:tcW w:type="dxa" w:w="1900"/>
+            <w:tcMar>
+              <w:top w:type="dxa" w:w="60"/>
+              <w:left w:type="dxa" w:w="100"/>
+              <w:bottom w:type="dxa" w:w="60"/>
+              <w:right w:type="dxa" w:w="100"/>
+            </w:tcMar>
+          </w:tcPr>
+          <w:p>
+            <w:pPr>
+              <w:jc w:val="left"/>
+            </w:pPr>
+            <w:r>
+              <w:rPr>
+                <w:rFonts w:ascii="Consolas" w:cs="Consolas" w:eastAsia="Consolas" w:hAnsi="Consolas"/>
+                <w:b w:val="false"/>
+                <w:bCs w:val="false"/>
+                <w:color w:val="1A1A1A"/>
+                <w:sz w:val="18"/>
+                <w:szCs w:val="18"/>
+              </w:rPr>
+              <w:t xml:space="preserve">Dept. of Defense</w:t>
+            </w:r>
+          </w:p>
+        </w:tc>
+        <w:tc>
+          <w:tcPr>
+            <w:tcW w:type="dxa" w:w="2960"/>
+            <w:tcMar>
+              <w:top w:type="dxa" w:w="60"/>
+              <w:left w:type="dxa" w:w="100"/>
+              <w:bottom w:type="dxa" w:w="60"/>
+              <w:right w:type="dxa" w:w="100"/>
+            </w:tcMar>
+          </w:tcPr>
+          <w:p>
+            <w:pPr>
+              <w:jc w:val="left"/>
+            </w:pPr>
+            <w:r>
+              <w:rPr>
+                <w:rFonts w:ascii="Consolas" w:cs="Consolas" w:eastAsia="Consolas" w:hAnsi="Consolas"/>
+                <w:b w:val="false"/>
+                <w:bCs w:val="false"/>
+                <w:color w:val="1A1A1A"/>
+                <w:sz w:val="18"/>
+                <w:szCs w:val="18"/>
+              </w:rPr>
+              <w:t xml:space="preserve">Pentagon heating &amp; refrigeration plant ops</w:t>
+            </w:r>
+          </w:p>
+        </w:tc>
+      </w:tr>
+      <w:tr>
+        <w:tc>
+          <w:tcPr>
+            <w:tcW w:type="dxa" w:w="2600"/>
+            <w:tcMar>
+              <w:top w:type="dxa" w:w="60"/>
+              <w:left w:type="dxa" w:w="100"/>
+              <w:bottom w:type="dxa" w:w="60"/>
+              <w:right w:type="dxa" w:w="100"/>
+            </w:tcMar>
+          </w:tcPr>
+          <w:p>
+            <w:pPr>
+              <w:jc w:val="left"/>
+            </w:pPr>
+            <w:r>
+              <w:rPr>
+                <w:b w:val="false"/>
+                <w:bCs w:val="false"/>
+                <w:color w:val="1A1A1A"/>
+                <w:sz w:val="20"/>
+                <w:szCs w:val="20"/>
+              </w:rPr>
+              <w:t xml:space="preserve">CONSIGLI CONSTRUCTION CO.</w:t>
+            </w:r>
+          </w:p>
+        </w:tc>
+        <w:tc>
+          <w:tcPr>
+            <w:tcW w:type="dxa" w:w="1900"/>
+            <w:tcMar>
+              <w:top w:type="dxa" w:w="60"/>
+              <w:left w:type="dxa" w:w="100"/>
+              <w:bottom w:type="dxa" w:w="60"/>
+              <w:right w:type="dxa" w:w="100"/>
+            </w:tcMar>
+          </w:tcPr>
+          <w:p>
+            <w:pPr>
+              <w:jc w:val="left"/>
+            </w:pPr>
+            <w:r>
+              <w:rPr>
+                <w:rFonts w:ascii="Consolas" w:cs="Consolas" w:eastAsia="Consolas" w:hAnsi="Consolas"/>
+                <w:b w:val="false"/>
+                <w:bCs w:val="false"/>
+                <w:color w:val="1A1A1A"/>
+                <w:sz w:val="18"/>
+                <w:szCs w:val="18"/>
+              </w:rPr>
+              <w:t xml:space="preserve">$40,917,263.00</w:t>
+            </w:r>
+          </w:p>
+        </w:tc>
+        <w:tc>
+          <w:tcPr>
+            <w:tcW w:type="dxa" w:w="1900"/>
+            <w:tcMar>
+              <w:top w:type="dxa" w:w="60"/>
+              <w:left w:type="dxa" w:w="100"/>
+              <w:bottom w:type="dxa" w:w="60"/>
+              <w:right w:type="dxa" w:w="100"/>
+            </w:tcMar>
+          </w:tcPr>
+          <w:p>
+            <w:pPr>
+              <w:jc w:val="left"/>
+            </w:pPr>
+            <w:r>
+              <w:rPr>
+                <w:rFonts w:ascii="Consolas" w:cs="Consolas" w:eastAsia="Consolas" w:hAnsi="Consolas"/>
+                <w:b w:val="false"/>
+                <w:bCs w:val="false"/>
+                <w:color w:val="1A1A1A"/>
+                <w:sz w:val="18"/>
+                <w:szCs w:val="18"/>
+              </w:rPr>
+              <w:t xml:space="preserve">GSA</w:t>
+            </w:r>
+          </w:p>
+        </w:tc>
+        <w:tc>
+          <w:tcPr>
+            <w:tcW w:type="dxa" w:w="2960"/>
+            <w:tcMar>
+              <w:top w:type="dxa" w:w="60"/>
+              <w:left w:type="dxa" w:w="100"/>
+              <w:bottom w:type="dxa" w:w="60"/>
+              <w:right w:type="dxa" w:w="100"/>
+            </w:tcMar>
+          </w:tcPr>
+          <w:p>
+            <w:pPr>
+              <w:jc w:val="left"/>
+            </w:pPr>
+            <w:r>
+              <w:rPr>
+                <w:rFonts w:ascii="Consolas" w:cs="Consolas" w:eastAsia="Consolas" w:hAnsi="Consolas"/>
+                <w:b w:val="false"/>
+                <w:bCs w:val="false"/>
+                <w:color w:val="1A1A1A"/>
+                <w:sz w:val="18"/>
+                <w:szCs w:val="18"/>
+              </w:rPr>
+              <w:t xml:space="preserve">HVAC construction management (CMC)</w:t>
+            </w:r>
+          </w:p>
+        </w:tc>
+      </w:tr>
+      <w:tr>
+        <w:tc>
+          <w:tcPr>
+            <w:tcW w:type="dxa" w:w="2600"/>
+            <w:tcMar>
+              <w:top w:type="dxa" w:w="60"/>
+              <w:left w:type="dxa" w:w="100"/>
+              <w:bottom w:type="dxa" w:w="60"/>
+              <w:right w:type="dxa" w:w="100"/>
+            </w:tcMar>
+          </w:tcPr>
+          <w:p>
+            <w:pPr>
+              <w:jc w:val="left"/>
+            </w:pPr>
+            <w:r>
+              <w:rPr>
+                <w:b w:val="false"/>
+                <w:bCs w:val="false"/>
+                <w:color w:val="1A1A1A"/>
+                <w:sz w:val="20"/>
+                <w:szCs w:val="20"/>
+              </w:rPr>
+              <w:t xml:space="preserve">HASKELL CORP</w:t>
+            </w:r>
+          </w:p>
+        </w:tc>
+        <w:tc>
+          <w:tcPr>
+            <w:tcW w:type="dxa" w:w="1900"/>
+            <w:tcMar>
+              <w:top w:type="dxa" w:w="60"/>
+              <w:left w:type="dxa" w:w="100"/>
+              <w:bottom w:type="dxa" w:w="60"/>
+              <w:right w:type="dxa" w:w="100"/>
+            </w:tcMar>
+          </w:tcPr>
+          <w:p>
+            <w:pPr>
+              <w:jc w:val="left"/>
+            </w:pPr>
+            <w:r>
+              <w:rPr>
+                <w:rFonts w:ascii="Consolas" w:cs="Consolas" w:eastAsia="Consolas" w:hAnsi="Consolas"/>
+                <w:b w:val="false"/>
+                <w:bCs w:val="false"/>
+                <w:color w:val="1A1A1A"/>
+                <w:sz w:val="18"/>
+                <w:szCs w:val="18"/>
+              </w:rPr>
+              <w:t xml:space="preserve">$39,321,248.41</w:t>
+            </w:r>
+          </w:p>
+        </w:tc>
+        <w:tc>
+          <w:tcPr>
+            <w:tcW w:type="dxa" w:w="1900"/>
+            <w:tcMar>
+              <w:top w:type="dxa" w:w="60"/>
+              <w:left w:type="dxa" w:w="100"/>
+              <w:bottom w:type="dxa" w:w="60"/>
+              <w:right w:type="dxa" w:w="100"/>
+            </w:tcMar>
+          </w:tcPr>
+          <w:p>
+            <w:pPr>
+              <w:jc w:val="left"/>
+            </w:pPr>
+            <w:r>
+              <w:rPr>
+                <w:rFonts w:ascii="Consolas" w:cs="Consolas" w:eastAsia="Consolas" w:hAnsi="Consolas"/>
+                <w:b w:val="false"/>
+                <w:bCs w:val="false"/>
+                <w:color w:val="1A1A1A"/>
+                <w:sz w:val="18"/>
+                <w:szCs w:val="18"/>
+              </w:rPr>
+              <w:t xml:space="preserve">Dept. of Defense</w:t>
+            </w:r>
+          </w:p>
+        </w:tc>
+        <w:tc>
+          <w:tcPr>
+            <w:tcW w:type="dxa" w:w="2960"/>
+            <w:tcMar>
+              <w:top w:type="dxa" w:w="60"/>
+              <w:left w:type="dxa" w:w="100"/>
+              <w:bottom w:type="dxa" w:w="60"/>
+              <w:right w:type="dxa" w:w="100"/>
+            </w:tcMar>
+          </w:tcPr>
+          <w:p>
+            <w:pPr>
+              <w:jc w:val="left"/>
+            </w:pPr>
+            <w:r>
+              <w:rPr>
+                <w:rFonts w:ascii="Consolas" w:cs="Consolas" w:eastAsia="Consolas" w:hAnsi="Consolas"/>
+                <w:b w:val="false"/>
+                <w:bCs w:val="false"/>
+                <w:color w:val="1A1A1A"/>
+                <w:sz w:val="18"/>
+                <w:szCs w:val="18"/>
+              </w:rPr>
+              <w:t xml:space="preserve">Construct CHPP turbine</w:t>
+            </w:r>
+          </w:p>
+        </w:tc>
+      </w:tr>
+      <w:tr>
+        <w:tc>
+          <w:tcPr>
+            <w:tcW w:type="dxa" w:w="2600"/>
+            <w:tcMar>
+              <w:top w:type="dxa" w:w="60"/>
+              <w:left w:type="dxa" w:w="100"/>
+              <w:bottom w:type="dxa" w:w="60"/>
+              <w:right w:type="dxa" w:w="100"/>
+            </w:tcMar>
+          </w:tcPr>
+          <w:p>
+            <w:pPr>
+              <w:jc w:val="left"/>
+            </w:pPr>
+            <w:r>
+              <w:rPr>
+                <w:b w:val="false"/>
+                <w:bCs w:val="false"/>
+                <w:color w:val="1A1A1A"/>
+                <w:sz w:val="20"/>
+                <w:szCs w:val="20"/>
+              </w:rPr>
+              <w:t xml:space="preserve">PIEDMONT NATURAL GAS CO.</w:t>
+            </w:r>
+          </w:p>
+        </w:tc>
+        <w:tc>
+          <w:tcPr>
+            <w:tcW w:type="dxa" w:w="1900"/>
+            <w:tcMar>
+              <w:top w:type="dxa" w:w="60"/>
+              <w:left w:type="dxa" w:w="100"/>
+              <w:bottom w:type="dxa" w:w="60"/>
+              <w:right w:type="dxa" w:w="100"/>
+            </w:tcMar>
+          </w:tcPr>
+          <w:p>
+            <w:pPr>
+              <w:jc w:val="left"/>
+            </w:pPr>
+            <w:r>
+              <w:rPr>
+                <w:rFonts w:ascii="Consolas" w:cs="Consolas" w:eastAsia="Consolas" w:hAnsi="Consolas"/>
+                <w:b w:val="false"/>
+                <w:bCs w:val="false"/>
+                <w:color w:val="1A1A1A"/>
+                <w:sz w:val="18"/>
+                <w:szCs w:val="18"/>
+              </w:rPr>
+              <w:t xml:space="preserve">$36,028,247.00</w:t>
+            </w:r>
+          </w:p>
+        </w:tc>
+        <w:tc>
+          <w:tcPr>
+            <w:tcW w:type="dxa" w:w="1900"/>
+            <w:tcMar>
+              <w:top w:type="dxa" w:w="60"/>
+              <w:left w:type="dxa" w:w="100"/>
+              <w:bottom w:type="dxa" w:w="60"/>
+              <w:right w:type="dxa" w:w="100"/>
+            </w:tcMar>
+          </w:tcPr>
+          <w:p>
+            <w:pPr>
+              <w:jc w:val="left"/>
+            </w:pPr>
+            <w:r>
+              <w:rPr>
+                <w:rFonts w:ascii="Consolas" w:cs="Consolas" w:eastAsia="Consolas" w:hAnsi="Consolas"/>
+                <w:b w:val="false"/>
+                <w:bCs w:val="false"/>
+                <w:color w:val="1A1A1A"/>
+                <w:sz w:val="18"/>
+                <w:szCs w:val="18"/>
+              </w:rPr>
+              <w:t xml:space="preserve">Dept. of Defense</w:t>
+            </w:r>
+          </w:p>
+        </w:tc>
+        <w:tc>
+          <w:tcPr>
+            <w:tcW w:type="dxa" w:w="2960"/>
+            <w:tcMar>
+              <w:top w:type="dxa" w:w="60"/>
+              <w:left w:type="dxa" w:w="100"/>
+              <w:bottom w:type="dxa" w:w="60"/>
+              <w:right w:type="dxa" w:w="100"/>
+            </w:tcMar>
+          </w:tcPr>
+          <w:p>
+            <w:pPr>
+              <w:jc w:val="left"/>
+            </w:pPr>
+            <w:r>
+              <w:rPr>
+                <w:rFonts w:ascii="Consolas" w:cs="Consolas" w:eastAsia="Consolas" w:hAnsi="Consolas"/>
+                <w:b w:val="false"/>
+                <w:bCs w:val="false"/>
+                <w:color w:val="1A1A1A"/>
+                <w:sz w:val="18"/>
+                <w:szCs w:val="18"/>
+              </w:rPr>
+              <w:t xml:space="preserve">Utility energy services contract</w:t>
+            </w:r>
+          </w:p>
+        </w:tc>
+      </w:tr>
+    </w:tbl>
+    <w:p>
+      <w:pPr>
+        <w:spacing w:after="140"/>
+      </w:pPr>
+      <w:r>
+        <w:t xml:space="preserve">These are large federal/institutional HVAC contracts — real evidence of federal-sector demand at a scale far above a typical 10–99-employee residential/commercial contractor, useful as market-context color, not as a target-band economic input.</w:t>
+      </w:r>
+    </w:p>
+    <w:p>
+      <w:pPr>
+        <w:pStyle w:val="Heading1"/>
+        <w:spacing w:after="160" w:before="360"/>
+      </w:pPr>
+      <w:r>
+        <w:t xml:space="preserve">14. YouTube — Market &amp; Competitor Discovery Search</w:t>
+      </w:r>
+    </w:p>
+    <w:p>
+      <w:pPr>
+        <w:spacing w:after="140"/>
+      </w:pPr>
+      <w:r>
+        <w:t xml:space="preserve">Source: YouTube Data API v3 search.list (real, keyed, quota-metered).</w:t>
+      </w:r>
+    </w:p>
+    <w:p>
+      <w:pPr>
+        <w:spacing w:after="80"/>
+      </w:pPr>
+      <w:r>
+        <w:rPr>
+          <w:rFonts w:ascii="Consolas" w:cs="Consolas" w:eastAsia="Consolas" w:hAnsi="Consolas"/>
+          <w:sz w:val="19"/>
+          <w:szCs w:val="19"/>
+        </w:rPr>
+        <w:t xml:space="preserve">Query: “HVAC dispatch software” — 15 real videos found, 100 quota units used</w:t>
+      </w:r>
+    </w:p>
+    <w:p>
+      <w:pPr>
+        <w:spacing w:after="140"/>
+      </w:pPr>
+      <w:r>
+        <w:t xml:space="preserve">Real video titles retrieved include named, real competitor tools — independently corroborating AUTONOMOUS-043’s M5 finding (Jobber, Sameday AI) from the separate 600-comment M2 pass:</w:t>
+      </w:r>
+    </w:p>
+    <w:p>
+      <w:pPr>
+        <w:pStyle w:val="ListParagraph"/>
+        <w:numPr>
+          <w:ilvl w:val="0"/>
+          <w:numId w:val="1"/>
+        </w:numPr>
+        <w:spacing w:after="60"/>
+      </w:pPr>
+      <w:r>
+        <w:t xml:space="preserve">“Best HVAC Dispatch Software in 2026? 6 Tools Compared”</w:t>
+      </w:r>
+    </w:p>
+    <w:p>
+      <w:pPr>
+        <w:pStyle w:val="ListParagraph"/>
+        <w:numPr>
+          <w:ilvl w:val="0"/>
+          <w:numId w:val="1"/>
+        </w:numPr>
+        <w:spacing w:after="60"/>
+      </w:pPr>
+      <w:r>
+        <w:t xml:space="preserve">“7 Best HVAC Scheduling Software: Find the Right Tool for Your Team”</w:t>
+      </w:r>
+    </w:p>
+    <w:p>
+      <w:pPr>
+        <w:pStyle w:val="ListParagraph"/>
+        <w:numPr>
+          <w:ilvl w:val="0"/>
+          <w:numId w:val="1"/>
+        </w:numPr>
+        <w:spacing w:after="60"/>
+      </w:pPr>
+      <w:r>
+        <w:t xml:space="preserve">“Best HVAC Dispatch Software in 2026: Jobber vs Housecall Pro vs FieldEdge”</w:t>
+      </w:r>
+    </w:p>
+    <w:p>
+      <w:pPr>
+        <w:pStyle w:val="ListParagraph"/>
+        <w:numPr>
+          <w:ilvl w:val="0"/>
+          <w:numId w:val="1"/>
+        </w:numPr>
+        <w:spacing w:after="60"/>
+      </w:pPr>
+      <w:r>
+        <w:t xml:space="preserve">“Dispatch Software for HVAC and Plumbers”</w:t>
+      </w:r>
+    </w:p>
+    <w:p>
+      <w:pPr>
+        <w:pStyle w:val="ListParagraph"/>
+        <w:numPr>
+          <w:ilvl w:val="0"/>
+          <w:numId w:val="1"/>
+        </w:numPr>
+        <w:spacing w:after="60"/>
+      </w:pPr>
+      <w:r>
+        <w:t xml:space="preserve">“HVAC Business: switching dispatch software”</w:t>
+      </w:r>
+    </w:p>
+    <w:p>
+      <w:pPr>
+        <w:spacing w:after="140"/>
+      </w:pPr>
+      <w:r>
+        <w:t xml:space="preserve">This single-query, 15-video pull is a discovery pass, not the full 600-comment M2 evidence corpus (13 queries, 1,409 real comments) already reported separately.</w:t>
+      </w:r>
+    </w:p>
+    <w:p>
+      <w:pPr>
+        <w:pStyle w:val="Heading1"/>
+        <w:spacing w:after="160" w:before="360"/>
+      </w:pPr>
+      <w:r>
+        <w:t xml:space="preserve">15. Sources Explicitly Skipped (Real Reasons, Not Silent Gaps)</w:t>
+      </w:r>
+    </w:p>
+    <w:p>
+      <w:pPr>
+        <w:pStyle w:val="ListParagraph"/>
+        <w:numPr>
+          <w:ilvl w:val="0"/>
+          <w:numId w:val="1"/>
+        </w:numPr>
+        <w:spacing w:after="60"/>
+      </w:pPr>
+      <w:r>
+        <w:t xml:space="preserve">BEA Regional — requires a specific target region; us_hvac_10_99’s geography.regions is intentionally empty until real state/metro discovery (AUTONOMOUS-035) selects one — the owner explicitly forbade hand-picking a region.</w:t>
+      </w:r>
+    </w:p>
+    <w:p>
+      <w:pPr>
+        <w:pStyle w:val="ListParagraph"/>
+        <w:numPr>
+          <w:ilvl w:val="0"/>
+          <w:numId w:val="1"/>
+        </w:numPr>
+        <w:spacing w:after="60"/>
+      </w:pPr>
+      <w:r>
+        <w:t xml:space="preserve">Common Crawl — requires one already policy-reviewed target URL (docs/SCRAPING_POLICY.md §4); no HVAC-industry URL has completed that review yet. A real, specific lead exists (Jobber’s own pricing page, named in real M2/M5 evidence) but registering it is a real, not-yet-done next step (AUTONOMOUS-041).</w:t>
+      </w:r>
+    </w:p>
+    <w:p>
+      <w:pPr>
+        <w:pStyle w:val="Heading1"/>
+        <w:spacing w:after="160" w:before="360"/>
+      </w:pPr>
+      <w:r>
+        <w:t xml:space="preserve">16. Reproducibility (All Sources)</w:t>
+      </w:r>
+    </w:p>
+    <w:p>
+      <w:pPr>
+        <w:spacing w:after="140"/>
+      </w:pPr>
+      <w:r>
+        <w:t xml:space="preserve">Part A (Census / M1 score):</w:t>
+      </w:r>
+    </w:p>
+    <w:p>
+      <w:pPr>
+        <w:spacing w:after="80"/>
+      </w:pPr>
+      <w:r>
+        <w:rPr>
+          <w:rFonts w:ascii="Consolas" w:cs="Consolas" w:eastAsia="Consolas" w:hAnsi="Consolas"/>
+          <w:sz w:val="19"/>
+          <w:szCs w:val="19"/>
+        </w:rPr>
+        <w:t xml:space="preserve">cd apps/api &amp;&amp; uv run python ../../scripts/run_census_m1.py</w:t>
+      </w:r>
+    </w:p>
+    <w:p>
+      <w:pPr>
+        <w:spacing w:after="140"/>
+      </w:pPr>
+      <w:r>
+        <w:t xml:space="preserve">Part B (BLS, SEC EDGAR, SAM.gov, USAspending, YouTube, BEA/Common Crawl skip status):</w:t>
+      </w:r>
+    </w:p>
+    <w:p>
+      <w:pPr>
+        <w:spacing w:after="80"/>
+      </w:pPr>
+      <w:r>
+        <w:rPr>
+          <w:rFonts w:ascii="Consolas" w:cs="Consolas" w:eastAsia="Consolas" w:hAnsi="Consolas"/>
+          <w:sz w:val="19"/>
+          <w:szCs w:val="19"/>
+        </w:rPr>
+        <w:t xml:space="preserve">cd apps/api &amp;&amp; uv run python ../../scripts/ingest_us_hvac_10_99.py</w:t>
+      </w:r>
+    </w:p>
+    <w:p>
+      <w:pPr>
+        <w:spacing w:after="140"/>
+      </w:pPr>
+      <w:r>
+        <w:t xml:space="preserve">Both scripts write every real raw API response to outputs/runs/&lt;run&gt;/raw/ for independent inspection, and require only free/keyless or already-configured API credentials (MASK_CENSUS_API_KEY, MASK_BLS_API_KEY [optional, raises rate limits], MASK_SAM_API_KEY, MASK_youtube_API_KEY, MASK_OFFICIAL_CONTACT_EMAIL).</w:t>
       </w:r>
     </w:p>
     <w:sectPr>

</xml_diff>